<commit_message>
Updated spike documentation with examples and seperate db info
</commit_message>
<xml_diff>
--- a/Spike_Report_Django_Background_Tasks.docx
+++ b/Spike_Report_Django_Background_Tasks.docx
@@ -100,7 +100,7 @@
         <w:widowControl w:val="1"/>
         <w:numPr>
           <w:ilvl w:val="0"/>
-          <w:numId w:val="1"/>
+          <w:numId w:val="4"/>
         </w:numPr>
         <w:pBdr>
           <w:top w:space="0" w:sz="0" w:val="nil"/>
@@ -143,7 +143,7 @@
         <w:widowControl w:val="1"/>
         <w:numPr>
           <w:ilvl w:val="0"/>
-          <w:numId w:val="1"/>
+          <w:numId w:val="4"/>
         </w:numPr>
         <w:pBdr>
           <w:top w:space="0" w:sz="0" w:val="nil"/>
@@ -186,7 +186,7 @@
         <w:widowControl w:val="1"/>
         <w:numPr>
           <w:ilvl w:val="0"/>
-          <w:numId w:val="1"/>
+          <w:numId w:val="4"/>
         </w:numPr>
         <w:pBdr>
           <w:top w:space="0" w:sz="0" w:val="nil"/>
@@ -1240,16 +1240,12 @@
       <w:pPr>
         <w:numPr>
           <w:ilvl w:val="0"/>
-          <w:numId w:val="1"/>
+          <w:numId w:val="5"/>
         </w:numPr>
         <w:spacing w:after="0" w:lineRule="auto"/>
-        <w:ind w:left="360"/>
-        <w:rPr>
-          <w:b w:val="0"/>
-          <w:bCs w:val="0"/>
-          <w:color w:val="000000"/>
-          <w:sz w:val="22"/>
-          <w:szCs w:val="22"/>
+        <w:ind w:left="720" w:hanging="360"/>
+        <w:rPr>
+          <w:u w:val="none"/>
         </w:rPr>
       </w:pPr>
       <w:r>
@@ -1269,63 +1265,2041 @@
     </w:p>
     <w:p>
       <w:pPr>
+        <w:numPr>
+          <w:ilvl w:val="0"/>
+          <w:numId w:val="5"/>
+        </w:numPr>
+        <w:spacing w:after="0" w:lineRule="auto"/>
+        <w:ind w:left="720" w:hanging="360"/>
+        <w:rPr>
+          <w:u w:val="none"/>
+        </w:rPr>
+      </w:pPr>
+      <w:r>
+        <w:rPr>
+          <w:b w:val="1"/>
+          <w:bCs w:val="1"/>
+          <w:rtl w:val="0"/>
+        </w:rPr>
+        <w:t xml:space="preserve">Database Contention</w:t>
+      </w:r>
+      <w:r>
+        <w:rPr>
+          <w:rtl w:val="0"/>
+        </w:rPr>
+        <w:t xml:space="preserve">: Django Tasks handled bulk operations well, but as task volume increases, "Enqueue Latency" rises because it competes with application writes.</w:t>
+      </w:r>
+    </w:p>
+    <w:p>
+      <w:pPr>
+        <w:numPr>
+          <w:ilvl w:val="0"/>
+          <w:numId w:val="5"/>
+        </w:numPr>
+        <w:ind w:left="720" w:hanging="360"/>
+        <w:rPr>
+          <w:u w:val="none"/>
+        </w:rPr>
+      </w:pPr>
+      <w:r>
+        <w:rPr>
+          <w:b w:val="1"/>
+          <w:bCs w:val="1"/>
+          <w:rtl w:val="0"/>
+        </w:rPr>
+        <w:t xml:space="preserve">HTTP Fan-out</w:t>
+      </w:r>
+      <w:r>
+        <w:rPr>
+          <w:rtl w:val="0"/>
+        </w:rPr>
+        <w:t xml:space="preserve">: Both systems handled thread-based fan-out identically, showing that for network-bound tasks, the broker choice is less critical than worker concurrency.</w:t>
+      </w:r>
+    </w:p>
+    <w:p>
+      <w:pPr>
+        <w:pStyle w:val="Heading1"/>
+        <w:rPr/>
+      </w:pPr>
+      <w:r>
+        <w:rPr>
+          <w:rtl w:val="0"/>
+        </w:rPr>
+        <w:t xml:space="preserve">5. Metric Insights: Where Django Tasks Succeeds and Fails</w:t>
+      </w:r>
+    </w:p>
+    <w:p>
+      <w:pPr>
+        <w:rPr/>
+      </w:pPr>
+      <w:r>
+        <w:rPr>
+          <w:rtl w:val="0"/>
+        </w:rPr>
+        <w:t xml:space="preserve">For Transactional Email and I/O tasks, the performance difference is statistically insignificant (~5%). </w:t>
+      </w:r>
+    </w:p>
+    <w:p>
+      <w:pPr>
+        <w:rPr>
+          <w:b w:val="1"/>
+          <w:bCs w:val="1"/>
+          <w:color w:val="006400"/>
+        </w:rPr>
+      </w:pPr>
+      <w:r>
+        <w:rPr>
+          <w:rtl w:val="0"/>
+        </w:rPr>
+        <w:t xml:space="preserve">The Throughput Burst test revealed a clear limitation. Celery handled 1,000 enqueued tasks with sub-second latency, while Django Tasks showed ~7 seconds. Database row-level locking is the primary bottleneck compared to in-memory Redis</w:t>
+      </w:r>
+      <w:r>
+        <w:rPr>
+          <w:rtl w:val="0"/>
+        </w:rPr>
+      </w:r>
+    </w:p>
+    <w:p>
+      <w:pPr>
+        <w:pStyle w:val="Heading1"/>
+        <w:keepNext w:val="1"/>
+        <w:keepLines w:val="1"/>
+        <w:pageBreakBefore w:val="0"/>
+        <w:widowControl w:val="1"/>
+        <w:pBdr>
+          <w:top w:space="0" w:sz="0" w:val="nil"/>
+          <w:left w:space="0" w:sz="0" w:val="nil"/>
+          <w:bottom w:space="0" w:sz="0" w:val="nil"/>
+          <w:right w:space="0" w:sz="0" w:val="nil"/>
+          <w:between w:space="0" w:sz="0" w:val="nil"/>
+        </w:pBdr>
+        <w:shd w:fill="auto" w:val="clear"/>
+        <w:spacing w:after="0" w:before="480" w:line="276" w:lineRule="auto"/>
+        <w:ind w:left="0" w:right="0" w:firstLine="0"/>
+        <w:jc w:val="left"/>
+        <w:rPr>
+          <w:rFonts w:ascii="Calibri" w:cs="Calibri" w:eastAsia="Calibri" w:hAnsi="Calibri"/>
+          <w:b w:val="1"/>
+          <w:bCs w:val="1"/>
+          <w:color w:val="366091"/>
+          <w:sz w:val="28"/>
+          <w:szCs w:val="28"/>
+        </w:rPr>
+      </w:pPr>
+      <w:r>
+        <w:rPr>
+          <w:rFonts w:ascii="Calibri" w:cs="Calibri" w:eastAsia="Calibri" w:hAnsi="Calibri"/>
+          <w:b w:val="1"/>
+          <w:bCs w:val="1"/>
+          <w:color w:val="366091"/>
+          <w:sz w:val="28"/>
+          <w:szCs w:val="28"/>
+          <w:rtl w:val="0"/>
+        </w:rPr>
+        <w:t xml:space="preserve">6. Initial Ideal Scenarios</w:t>
+      </w:r>
+    </w:p>
+    <w:p>
+      <w:pPr>
+        <w:pStyle w:val="Heading2"/>
+        <w:keepNext w:val="1"/>
+        <w:keepLines w:val="1"/>
+        <w:pageBreakBefore w:val="0"/>
+        <w:widowControl w:val="1"/>
+        <w:pBdr>
+          <w:top w:space="0" w:sz="0" w:val="nil"/>
+          <w:left w:space="0" w:sz="0" w:val="nil"/>
+          <w:bottom w:space="0" w:sz="0" w:val="nil"/>
+          <w:right w:space="0" w:sz="0" w:val="nil"/>
+          <w:between w:space="0" w:sz="0" w:val="nil"/>
+        </w:pBdr>
+        <w:shd w:fill="auto" w:val="clear"/>
+        <w:spacing w:after="0" w:before="200" w:line="276" w:lineRule="auto"/>
+        <w:ind w:left="0" w:right="0" w:firstLine="0"/>
+        <w:jc w:val="left"/>
+        <w:rPr>
+          <w:rFonts w:ascii="Calibri" w:cs="Calibri" w:eastAsia="Calibri" w:hAnsi="Calibri"/>
+          <w:b w:val="1"/>
+          <w:bCs w:val="1"/>
+          <w:color w:val="4f81bd"/>
+          <w:sz w:val="26"/>
+          <w:szCs w:val="26"/>
+        </w:rPr>
+      </w:pPr>
+      <w:r>
+        <w:rPr>
+          <w:rFonts w:ascii="Calibri" w:cs="Calibri" w:eastAsia="Calibri" w:hAnsi="Calibri"/>
+          <w:b w:val="1"/>
+          <w:bCs w:val="1"/>
+          <w:color w:val="4f81bd"/>
+          <w:sz w:val="26"/>
+          <w:szCs w:val="26"/>
+          <w:rtl w:val="0"/>
+        </w:rPr>
+        <w:t xml:space="preserve">Scenario A: User Sign-up Email</w:t>
+      </w:r>
+    </w:p>
+    <w:p>
+      <w:pPr>
+        <w:keepNext w:val="0"/>
+        <w:keepLines w:val="0"/>
+        <w:pageBreakBefore w:val="0"/>
+        <w:widowControl w:val="1"/>
+        <w:pBdr>
+          <w:top w:space="0" w:sz="0" w:val="nil"/>
+          <w:left w:space="0" w:sz="0" w:val="nil"/>
+          <w:bottom w:space="0" w:sz="0" w:val="nil"/>
+          <w:right w:space="0" w:sz="0" w:val="nil"/>
+          <w:between w:space="0" w:sz="0" w:val="nil"/>
+        </w:pBdr>
+        <w:shd w:fill="auto" w:val="clear"/>
+        <w:spacing w:after="200" w:before="0" w:line="276" w:lineRule="auto"/>
+        <w:ind w:left="0" w:right="0" w:firstLine="0"/>
+        <w:jc w:val="left"/>
+        <w:rPr/>
+      </w:pPr>
+      <w:r>
+        <w:rPr>
+          <w:b w:val="1"/>
+          <w:bCs w:val="1"/>
+          <w:rtl w:val="0"/>
+        </w:rPr>
+        <w:t xml:space="preserve">Choice: Django Tasks.</w:t>
+      </w:r>
+      <w:r>
+        <w:rPr>
+          <w:rtl w:val="0"/>
+        </w:rPr>
+        <w:t xml:space="preserve"> Native atomicity ensures emails only send if user creation succeeds.</w:t>
+      </w:r>
+    </w:p>
+    <w:p>
+      <w:pPr>
+        <w:pStyle w:val="Heading2"/>
+        <w:keepNext w:val="1"/>
+        <w:keepLines w:val="1"/>
+        <w:pageBreakBefore w:val="0"/>
+        <w:widowControl w:val="1"/>
+        <w:pBdr>
+          <w:top w:space="0" w:sz="0" w:val="nil"/>
+          <w:left w:space="0" w:sz="0" w:val="nil"/>
+          <w:bottom w:space="0" w:sz="0" w:val="nil"/>
+          <w:right w:space="0" w:sz="0" w:val="nil"/>
+          <w:between w:space="0" w:sz="0" w:val="nil"/>
+        </w:pBdr>
+        <w:shd w:fill="auto" w:val="clear"/>
+        <w:spacing w:after="0" w:before="200" w:line="276" w:lineRule="auto"/>
+        <w:ind w:left="0" w:right="0" w:firstLine="0"/>
+        <w:jc w:val="left"/>
+        <w:rPr>
+          <w:rFonts w:ascii="Calibri" w:cs="Calibri" w:eastAsia="Calibri" w:hAnsi="Calibri"/>
+          <w:b w:val="1"/>
+          <w:bCs w:val="1"/>
+          <w:color w:val="4f81bd"/>
+          <w:sz w:val="26"/>
+          <w:szCs w:val="26"/>
+        </w:rPr>
+      </w:pPr>
+      <w:r>
+        <w:rPr>
+          <w:rFonts w:ascii="Calibri" w:cs="Calibri" w:eastAsia="Calibri" w:hAnsi="Calibri"/>
+          <w:b w:val="1"/>
+          <w:bCs w:val="1"/>
+          <w:color w:val="4f81bd"/>
+          <w:sz w:val="26"/>
+          <w:szCs w:val="26"/>
+          <w:rtl w:val="0"/>
+        </w:rPr>
+        <w:t xml:space="preserve">Scenario B: Daily PDF Reports</w:t>
+      </w:r>
+    </w:p>
+    <w:p>
+      <w:pPr>
+        <w:keepNext w:val="0"/>
+        <w:keepLines w:val="0"/>
+        <w:pageBreakBefore w:val="0"/>
+        <w:widowControl w:val="1"/>
+        <w:pBdr>
+          <w:top w:space="0" w:sz="0" w:val="nil"/>
+          <w:left w:space="0" w:sz="0" w:val="nil"/>
+          <w:bottom w:space="0" w:sz="0" w:val="nil"/>
+          <w:right w:space="0" w:sz="0" w:val="nil"/>
+          <w:between w:space="0" w:sz="0" w:val="nil"/>
+        </w:pBdr>
+        <w:shd w:fill="auto" w:val="clear"/>
+        <w:spacing w:after="200" w:before="0" w:line="276" w:lineRule="auto"/>
+        <w:ind w:left="0" w:right="0" w:firstLine="0"/>
+        <w:jc w:val="left"/>
+        <w:rPr/>
+      </w:pPr>
+      <w:r>
+        <w:rPr>
+          <w:b w:val="1"/>
+          <w:bCs w:val="1"/>
+          <w:rtl w:val="0"/>
+        </w:rPr>
+        <w:t xml:space="preserve">Choice: Django Tasks.</w:t>
+      </w:r>
+      <w:r>
+        <w:rPr>
+          <w:rtl w:val="0"/>
+        </w:rPr>
+        <w:t xml:space="preserve"> Long-running isolated tasks where latency doesn't impact UX.</w:t>
+      </w:r>
+    </w:p>
+    <w:p>
+      <w:pPr>
+        <w:pStyle w:val="Heading2"/>
+        <w:keepNext w:val="1"/>
+        <w:keepLines w:val="1"/>
+        <w:pageBreakBefore w:val="0"/>
+        <w:widowControl w:val="1"/>
+        <w:pBdr>
+          <w:top w:space="0" w:sz="0" w:val="nil"/>
+          <w:left w:space="0" w:sz="0" w:val="nil"/>
+          <w:bottom w:space="0" w:sz="0" w:val="nil"/>
+          <w:right w:space="0" w:sz="0" w:val="nil"/>
+          <w:between w:space="0" w:sz="0" w:val="nil"/>
+        </w:pBdr>
+        <w:shd w:fill="auto" w:val="clear"/>
+        <w:spacing w:after="0" w:before="200" w:line="276" w:lineRule="auto"/>
+        <w:ind w:left="0" w:right="0" w:firstLine="0"/>
+        <w:jc w:val="left"/>
+        <w:rPr>
+          <w:rFonts w:ascii="Calibri" w:cs="Calibri" w:eastAsia="Calibri" w:hAnsi="Calibri"/>
+          <w:b w:val="1"/>
+          <w:bCs w:val="1"/>
+          <w:color w:val="4f81bd"/>
+          <w:sz w:val="26"/>
+          <w:szCs w:val="26"/>
+        </w:rPr>
+      </w:pPr>
+      <w:r>
+        <w:rPr>
+          <w:rFonts w:ascii="Calibri" w:cs="Calibri" w:eastAsia="Calibri" w:hAnsi="Calibri"/>
+          <w:b w:val="1"/>
+          <w:bCs w:val="1"/>
+          <w:color w:val="4f81bd"/>
+          <w:sz w:val="26"/>
+          <w:szCs w:val="26"/>
+          <w:rtl w:val="0"/>
+        </w:rPr>
+        <w:t xml:space="preserve">Scenario C: Real-time Notifications</w:t>
+      </w:r>
+    </w:p>
+    <w:p>
+      <w:pPr>
+        <w:keepNext w:val="0"/>
+        <w:keepLines w:val="0"/>
+        <w:pageBreakBefore w:val="0"/>
+        <w:widowControl w:val="1"/>
+        <w:pBdr>
+          <w:top w:space="0" w:sz="0" w:val="nil"/>
+          <w:left w:space="0" w:sz="0" w:val="nil"/>
+          <w:bottom w:space="0" w:sz="0" w:val="nil"/>
+          <w:right w:space="0" w:sz="0" w:val="nil"/>
+          <w:between w:space="0" w:sz="0" w:val="nil"/>
+        </w:pBdr>
+        <w:shd w:fill="auto" w:val="clear"/>
+        <w:spacing w:after="200" w:before="0" w:line="276" w:lineRule="auto"/>
+        <w:ind w:left="0" w:right="0" w:firstLine="0"/>
+        <w:jc w:val="left"/>
+        <w:rPr/>
+      </w:pPr>
+      <w:r>
+        <w:rPr>
+          <w:b w:val="1"/>
+          <w:bCs w:val="1"/>
+          <w:rtl w:val="0"/>
+        </w:rPr>
+        <w:t xml:space="preserve">Choice: Celery.</w:t>
+      </w:r>
+      <w:r>
+        <w:rPr>
+          <w:rtl w:val="0"/>
+        </w:rPr>
+        <w:t xml:space="preserve"> High-frequency tasks need in-memory broker to prevent DB bottlenecks.</w:t>
+      </w:r>
+    </w:p>
+    <w:p>
+      <w:pPr>
+        <w:pStyle w:val="Heading1"/>
+        <w:keepNext w:val="1"/>
+        <w:keepLines w:val="1"/>
+        <w:pageBreakBefore w:val="0"/>
+        <w:widowControl w:val="1"/>
+        <w:pBdr>
+          <w:top w:space="0" w:sz="0" w:val="nil"/>
+          <w:left w:space="0" w:sz="0" w:val="nil"/>
+          <w:bottom w:space="0" w:sz="0" w:val="nil"/>
+          <w:right w:space="0" w:sz="0" w:val="nil"/>
+          <w:between w:space="0" w:sz="0" w:val="nil"/>
+        </w:pBdr>
+        <w:shd w:fill="auto" w:val="clear"/>
+        <w:spacing w:after="0" w:before="480" w:line="276" w:lineRule="auto"/>
+        <w:ind w:left="0" w:right="0" w:firstLine="0"/>
+        <w:jc w:val="left"/>
+        <w:rPr>
+          <w:rFonts w:ascii="Calibri" w:cs="Calibri" w:eastAsia="Calibri" w:hAnsi="Calibri"/>
+          <w:b w:val="1"/>
+          <w:bCs w:val="1"/>
+          <w:color w:val="366091"/>
+          <w:sz w:val="28"/>
+          <w:szCs w:val="28"/>
+        </w:rPr>
+      </w:pPr>
+      <w:r>
+        <w:rPr>
+          <w:rFonts w:ascii="Calibri" w:cs="Calibri" w:eastAsia="Calibri" w:hAnsi="Calibri"/>
+          <w:b w:val="1"/>
+          <w:bCs w:val="1"/>
+          <w:color w:val="366091"/>
+          <w:sz w:val="28"/>
+          <w:szCs w:val="28"/>
+          <w:rtl w:val="0"/>
+        </w:rPr>
+        <w:t xml:space="preserve">7. Alternative Database Backend Options</w:t>
+      </w:r>
+    </w:p>
+    <w:p>
+      <w:pPr>
+        <w:pStyle w:val="Heading2"/>
+        <w:keepNext w:val="1"/>
+        <w:keepLines w:val="1"/>
+        <w:pageBreakBefore w:val="0"/>
+        <w:widowControl w:val="1"/>
+        <w:pBdr>
+          <w:top w:space="0" w:sz="0" w:val="nil"/>
+          <w:left w:space="0" w:sz="0" w:val="nil"/>
+          <w:bottom w:space="0" w:sz="0" w:val="nil"/>
+          <w:right w:space="0" w:sz="0" w:val="nil"/>
+          <w:between w:space="0" w:sz="0" w:val="nil"/>
+        </w:pBdr>
+        <w:shd w:fill="auto" w:val="clear"/>
+        <w:spacing w:after="0" w:before="200" w:line="276" w:lineRule="auto"/>
+        <w:ind w:left="0" w:right="0" w:firstLine="0"/>
+        <w:jc w:val="left"/>
+        <w:rPr>
+          <w:rFonts w:ascii="Calibri" w:cs="Calibri" w:eastAsia="Calibri" w:hAnsi="Calibri"/>
+          <w:b w:val="1"/>
+          <w:bCs w:val="1"/>
+          <w:color w:val="4f81bd"/>
+          <w:sz w:val="26"/>
+          <w:szCs w:val="26"/>
+        </w:rPr>
+      </w:pPr>
+      <w:r>
+        <w:rPr>
+          <w:rFonts w:ascii="Calibri" w:cs="Calibri" w:eastAsia="Calibri" w:hAnsi="Calibri"/>
+          <w:b w:val="1"/>
+          <w:bCs w:val="1"/>
+          <w:color w:val="4f81bd"/>
+          <w:sz w:val="26"/>
+          <w:szCs w:val="26"/>
+          <w:rtl w:val="0"/>
+        </w:rPr>
+        <w:t xml:space="preserve">Can Django Tasks Use MongoDB/Redis as Backend?</w:t>
+      </w:r>
+    </w:p>
+    <w:p>
+      <w:pPr>
+        <w:keepNext w:val="0"/>
+        <w:keepLines w:val="0"/>
+        <w:pageBreakBefore w:val="0"/>
+        <w:widowControl w:val="1"/>
+        <w:pBdr>
+          <w:top w:space="0" w:sz="0" w:val="nil"/>
+          <w:left w:space="0" w:sz="0" w:val="nil"/>
+          <w:bottom w:space="0" w:sz="0" w:val="nil"/>
+          <w:right w:space="0" w:sz="0" w:val="nil"/>
+          <w:between w:space="0" w:sz="0" w:val="nil"/>
+        </w:pBdr>
+        <w:shd w:fill="auto" w:val="clear"/>
+        <w:spacing w:after="200" w:before="0" w:line="276" w:lineRule="auto"/>
+        <w:ind w:left="0" w:right="0" w:firstLine="0"/>
+        <w:jc w:val="left"/>
+        <w:rPr/>
+      </w:pPr>
+      <w:r>
+        <w:rPr>
+          <w:rtl w:val="0"/>
+        </w:rPr>
+        <w:t xml:space="preserve">Short Answer: Technically possible but NOT recommended.</w:t>
+      </w:r>
+    </w:p>
+    <w:p>
+      <w:pPr>
+        <w:pStyle w:val="Heading2"/>
+        <w:keepNext w:val="1"/>
+        <w:keepLines w:val="1"/>
+        <w:pageBreakBefore w:val="0"/>
+        <w:widowControl w:val="1"/>
+        <w:pBdr>
+          <w:top w:space="0" w:sz="0" w:val="nil"/>
+          <w:left w:space="0" w:sz="0" w:val="nil"/>
+          <w:bottom w:space="0" w:sz="0" w:val="nil"/>
+          <w:right w:space="0" w:sz="0" w:val="nil"/>
+          <w:between w:space="0" w:sz="0" w:val="nil"/>
+        </w:pBdr>
+        <w:shd w:fill="auto" w:val="clear"/>
+        <w:spacing w:after="0" w:before="200" w:line="276" w:lineRule="auto"/>
+        <w:ind w:left="0" w:right="0" w:firstLine="0"/>
+        <w:jc w:val="left"/>
+        <w:rPr>
+          <w:rFonts w:ascii="Calibri" w:cs="Calibri" w:eastAsia="Calibri" w:hAnsi="Calibri"/>
+          <w:b w:val="1"/>
+          <w:bCs w:val="1"/>
+          <w:color w:val="4f81bd"/>
+          <w:sz w:val="26"/>
+          <w:szCs w:val="26"/>
+        </w:rPr>
+      </w:pPr>
+      <w:r>
+        <w:rPr>
+          <w:rFonts w:ascii="Calibri" w:cs="Calibri" w:eastAsia="Calibri" w:hAnsi="Calibri"/>
+          <w:b w:val="1"/>
+          <w:bCs w:val="1"/>
+          <w:color w:val="4f81bd"/>
+          <w:sz w:val="26"/>
+          <w:szCs w:val="26"/>
+          <w:rtl w:val="0"/>
+        </w:rPr>
+        <w:t xml:space="preserve">Why Separate Databases Are Problematic:</w:t>
+      </w:r>
+    </w:p>
+    <w:p>
+      <w:pPr>
+        <w:keepNext w:val="0"/>
+        <w:keepLines w:val="0"/>
+        <w:pageBreakBefore w:val="0"/>
+        <w:widowControl w:val="1"/>
+        <w:numPr>
+          <w:ilvl w:val="0"/>
+          <w:numId w:val="3"/>
+        </w:numPr>
+        <w:pBdr>
+          <w:top w:space="0" w:sz="0" w:val="nil"/>
+          <w:left w:space="0" w:sz="0" w:val="nil"/>
+          <w:bottom w:space="0" w:sz="0" w:val="nil"/>
+          <w:right w:space="0" w:sz="0" w:val="nil"/>
+          <w:between w:space="0" w:sz="0" w:val="nil"/>
+        </w:pBdr>
+        <w:shd w:fill="auto" w:val="clear"/>
+        <w:spacing w:after="0" w:afterAutospacing="0" w:before="0" w:line="276" w:lineRule="auto"/>
+        <w:ind w:left="720" w:right="0" w:hanging="360"/>
+        <w:jc w:val="left"/>
+        <w:rPr>
+          <w:u w:val="none"/>
+        </w:rPr>
+      </w:pPr>
+      <w:r>
+        <w:rPr>
+          <w:rtl w:val="0"/>
+        </w:rPr>
+        <w:t xml:space="preserve">Loss of Transactional Integrity: You lose the atomic enqueue guarantee.</w:t>
+      </w:r>
+    </w:p>
+    <w:p>
+      <w:pPr>
+        <w:keepNext w:val="0"/>
+        <w:keepLines w:val="0"/>
+        <w:pageBreakBefore w:val="0"/>
+        <w:widowControl w:val="1"/>
+        <w:numPr>
+          <w:ilvl w:val="0"/>
+          <w:numId w:val="3"/>
+        </w:numPr>
+        <w:pBdr>
+          <w:top w:space="0" w:sz="0" w:val="nil"/>
+          <w:left w:space="0" w:sz="0" w:val="nil"/>
+          <w:bottom w:space="0" w:sz="0" w:val="nil"/>
+          <w:right w:space="0" w:sz="0" w:val="nil"/>
+          <w:between w:space="0" w:sz="0" w:val="nil"/>
+        </w:pBdr>
+        <w:shd w:fill="auto" w:val="clear"/>
+        <w:spacing w:after="0" w:afterAutospacing="0" w:before="0" w:line="276" w:lineRule="auto"/>
+        <w:ind w:left="720" w:right="0" w:hanging="360"/>
+        <w:jc w:val="left"/>
+        <w:rPr>
+          <w:u w:val="none"/>
+        </w:rPr>
+      </w:pPr>
+      <w:r>
+        <w:rPr>
+          <w:rtl w:val="0"/>
+        </w:rPr>
+        <w:t xml:space="preserve">Increased Complexity: Managing additional database connections defeats the simplicity benefit.</w:t>
+      </w:r>
+    </w:p>
+    <w:p>
+      <w:pPr>
+        <w:keepNext w:val="0"/>
+        <w:keepLines w:val="0"/>
+        <w:pageBreakBefore w:val="0"/>
+        <w:widowControl w:val="1"/>
+        <w:numPr>
+          <w:ilvl w:val="0"/>
+          <w:numId w:val="3"/>
+        </w:numPr>
+        <w:pBdr>
+          <w:top w:space="0" w:sz="0" w:val="nil"/>
+          <w:left w:space="0" w:sz="0" w:val="nil"/>
+          <w:bottom w:space="0" w:sz="0" w:val="nil"/>
+          <w:right w:space="0" w:sz="0" w:val="nil"/>
+          <w:between w:space="0" w:sz="0" w:val="nil"/>
+        </w:pBdr>
+        <w:shd w:fill="auto" w:val="clear"/>
+        <w:spacing w:after="200" w:before="0" w:line="276" w:lineRule="auto"/>
+        <w:ind w:left="720" w:right="0" w:hanging="360"/>
+        <w:jc w:val="left"/>
+        <w:rPr>
+          <w:u w:val="none"/>
+        </w:rPr>
+      </w:pPr>
+      <w:r>
+        <w:rPr>
+          <w:rtl w:val="0"/>
+        </w:rPr>
+        <w:t xml:space="preserve">No Performance Gain: Redis-backed Django Tasks is slower than native Celery.</w:t>
+      </w:r>
+    </w:p>
+    <w:p>
+      <w:pPr>
+        <w:spacing w:after="360" w:line="276" w:lineRule="auto"/>
+        <w:rPr>
+          <w:b w:val="1"/>
+          <w:bCs w:val="1"/>
+          <w:color w:val="006400"/>
+        </w:rPr>
+      </w:pPr>
+      <w:r>
+        <w:rPr>
+          <w:b w:val="1"/>
+          <w:bCs w:val="1"/>
+          <w:rtl w:val="0"/>
+        </w:rPr>
+        <w:t xml:space="preserve">Recommendation: </w:t>
+      </w:r>
+      <w:r>
+        <w:rPr>
+          <w:rtl w:val="0"/>
+        </w:rPr>
+        <w:t xml:space="preserve">Use DatabaseBackend with your primary DB, or switch to Celery entirely.</w:t>
+      </w:r>
+      <w:r>
+        <w:rPr>
+          <w:rtl w:val="0"/>
+        </w:rPr>
+      </w:r>
+    </w:p>
+    <w:p>
+      <w:pPr>
+        <w:pStyle w:val="Heading1"/>
+        <w:keepNext w:val="1"/>
+        <w:keepLines w:val="1"/>
+        <w:pageBreakBefore w:val="0"/>
+        <w:widowControl w:val="1"/>
+        <w:pBdr>
+          <w:top w:space="0" w:sz="0" w:val="nil"/>
+          <w:left w:space="0" w:sz="0" w:val="nil"/>
+          <w:bottom w:space="0" w:sz="0" w:val="nil"/>
+          <w:right w:space="0" w:sz="0" w:val="nil"/>
+          <w:between w:space="0" w:sz="0" w:val="nil"/>
+        </w:pBdr>
+        <w:shd w:fill="auto" w:val="clear"/>
+        <w:spacing w:after="0" w:before="480" w:line="276" w:lineRule="auto"/>
+        <w:ind w:left="0" w:right="0" w:firstLine="0"/>
+        <w:jc w:val="left"/>
+        <w:rPr>
+          <w:rFonts w:ascii="Calibri" w:cs="Calibri" w:eastAsia="Calibri" w:hAnsi="Calibri"/>
+          <w:b w:val="1"/>
+          <w:bCs w:val="1"/>
+          <w:color w:val="366091"/>
+          <w:sz w:val="28"/>
+          <w:szCs w:val="28"/>
+        </w:rPr>
+      </w:pPr>
+      <w:r>
+        <w:rPr>
+          <w:rFonts w:ascii="Calibri" w:cs="Calibri" w:eastAsia="Calibri" w:hAnsi="Calibri"/>
+          <w:b w:val="1"/>
+          <w:bCs w:val="1"/>
+          <w:color w:val="366091"/>
+          <w:sz w:val="28"/>
+          <w:szCs w:val="28"/>
+          <w:rtl w:val="0"/>
+        </w:rPr>
+        <w:t xml:space="preserve">8. Expanded Scenarios: When Django Tasks Fails</w:t>
+      </w:r>
+    </w:p>
+    <w:p>
+      <w:pPr>
+        <w:pStyle w:val="Heading2"/>
+        <w:keepNext w:val="1"/>
+        <w:keepLines w:val="1"/>
+        <w:pageBreakBefore w:val="0"/>
+        <w:widowControl w:val="1"/>
+        <w:pBdr>
+          <w:top w:space="0" w:sz="0" w:val="nil"/>
+          <w:left w:space="0" w:sz="0" w:val="nil"/>
+          <w:bottom w:space="0" w:sz="0" w:val="nil"/>
+          <w:right w:space="0" w:sz="0" w:val="nil"/>
+          <w:between w:space="0" w:sz="0" w:val="nil"/>
+        </w:pBdr>
+        <w:shd w:fill="auto" w:val="clear"/>
+        <w:spacing w:after="0" w:before="200" w:line="276" w:lineRule="auto"/>
+        <w:ind w:left="0" w:right="0" w:firstLine="0"/>
+        <w:jc w:val="left"/>
+        <w:rPr>
+          <w:rFonts w:ascii="Calibri" w:cs="Calibri" w:eastAsia="Calibri" w:hAnsi="Calibri"/>
+          <w:b w:val="1"/>
+          <w:bCs w:val="1"/>
+          <w:color w:val="4f81bd"/>
+          <w:sz w:val="26"/>
+          <w:szCs w:val="26"/>
+        </w:rPr>
+      </w:pPr>
+      <w:r>
+        <w:rPr>
+          <w:rFonts w:ascii="Calibri" w:cs="Calibri" w:eastAsia="Calibri" w:hAnsi="Calibri"/>
+          <w:b w:val="1"/>
+          <w:bCs w:val="1"/>
+          <w:color w:val="4f81bd"/>
+          <w:sz w:val="26"/>
+          <w:szCs w:val="26"/>
+          <w:rtl w:val="0"/>
+        </w:rPr>
+        <w:t xml:space="preserve">Scenario: Video Transcoding Pipeline</w:t>
+      </w:r>
+    </w:p>
+    <w:p>
+      <w:pPr>
+        <w:keepNext w:val="0"/>
+        <w:keepLines w:val="0"/>
+        <w:pageBreakBefore w:val="0"/>
+        <w:widowControl w:val="1"/>
+        <w:pBdr>
+          <w:top w:space="0" w:sz="0" w:val="nil"/>
+          <w:left w:space="0" w:sz="0" w:val="nil"/>
+          <w:bottom w:space="0" w:sz="0" w:val="nil"/>
+          <w:right w:space="0" w:sz="0" w:val="nil"/>
+          <w:between w:space="0" w:sz="0" w:val="nil"/>
+        </w:pBdr>
+        <w:shd w:fill="auto" w:val="clear"/>
+        <w:spacing w:after="200" w:before="0" w:line="276" w:lineRule="auto"/>
+        <w:ind w:left="0" w:right="0" w:firstLine="0"/>
+        <w:jc w:val="left"/>
+        <w:rPr/>
+      </w:pPr>
+      <w:r>
+        <w:rPr>
+          <w:b w:val="1"/>
+          <w:bCs w:val="1"/>
+          <w:rtl w:val="0"/>
+        </w:rPr>
+        <w:t xml:space="preserve">Choice: Celery.</w:t>
+      </w:r>
+      <w:r>
+        <w:rPr>
+          <w:rtl w:val="0"/>
+        </w:rPr>
+        <w:t xml:space="preserve"> Requires long-running tasks (10+ min), task chaining, and priority queues.</w:t>
+      </w:r>
+    </w:p>
+    <w:p>
+      <w:pPr>
+        <w:pStyle w:val="Heading2"/>
+        <w:keepNext w:val="1"/>
+        <w:keepLines w:val="1"/>
+        <w:pageBreakBefore w:val="0"/>
+        <w:widowControl w:val="1"/>
+        <w:pBdr>
+          <w:top w:space="0" w:sz="0" w:val="nil"/>
+          <w:left w:space="0" w:sz="0" w:val="nil"/>
+          <w:bottom w:space="0" w:sz="0" w:val="nil"/>
+          <w:right w:space="0" w:sz="0" w:val="nil"/>
+          <w:between w:space="0" w:sz="0" w:val="nil"/>
+        </w:pBdr>
+        <w:shd w:fill="auto" w:val="clear"/>
+        <w:spacing w:after="0" w:before="200" w:line="276" w:lineRule="auto"/>
+        <w:ind w:left="0" w:right="0" w:firstLine="0"/>
+        <w:jc w:val="left"/>
+        <w:rPr>
+          <w:rFonts w:ascii="Calibri" w:cs="Calibri" w:eastAsia="Calibri" w:hAnsi="Calibri"/>
+          <w:b w:val="1"/>
+          <w:bCs w:val="1"/>
+          <w:color w:val="4f81bd"/>
+          <w:sz w:val="26"/>
+          <w:szCs w:val="26"/>
+        </w:rPr>
+      </w:pPr>
+      <w:r>
+        <w:rPr>
+          <w:rFonts w:ascii="Calibri" w:cs="Calibri" w:eastAsia="Calibri" w:hAnsi="Calibri"/>
+          <w:b w:val="1"/>
+          <w:bCs w:val="1"/>
+          <w:color w:val="4f81bd"/>
+          <w:sz w:val="26"/>
+          <w:szCs w:val="26"/>
+          <w:rtl w:val="0"/>
+        </w:rPr>
+        <w:t xml:space="preserve">Scenario: Real-time Chat Delivery</w:t>
+      </w:r>
+    </w:p>
+    <w:p>
+      <w:pPr>
+        <w:keepNext w:val="0"/>
+        <w:keepLines w:val="0"/>
+        <w:pageBreakBefore w:val="0"/>
+        <w:widowControl w:val="1"/>
+        <w:pBdr>
+          <w:top w:space="0" w:sz="0" w:val="nil"/>
+          <w:left w:space="0" w:sz="0" w:val="nil"/>
+          <w:bottom w:space="0" w:sz="0" w:val="nil"/>
+          <w:right w:space="0" w:sz="0" w:val="nil"/>
+          <w:between w:space="0" w:sz="0" w:val="nil"/>
+        </w:pBdr>
+        <w:shd w:fill="auto" w:val="clear"/>
+        <w:spacing w:after="200" w:before="0" w:line="276" w:lineRule="auto"/>
+        <w:ind w:left="0" w:right="0" w:firstLine="0"/>
+        <w:jc w:val="left"/>
+        <w:rPr/>
+      </w:pPr>
+      <w:r>
+        <w:rPr>
+          <w:b w:val="1"/>
+          <w:bCs w:val="1"/>
+          <w:rtl w:val="0"/>
+        </w:rPr>
+        <w:t xml:space="preserve">Choice: Celery. </w:t>
+      </w:r>
+      <w:r>
+        <w:rPr>
+          <w:rtl w:val="0"/>
+        </w:rPr>
+        <w:t xml:space="preserve">Needs sub-100ms latency. DB polling introduces 1-5s delays.</w:t>
+      </w:r>
+    </w:p>
+    <w:p>
+      <w:pPr>
+        <w:pStyle w:val="Heading2"/>
+        <w:keepNext w:val="1"/>
+        <w:keepLines w:val="1"/>
+        <w:pageBreakBefore w:val="0"/>
+        <w:widowControl w:val="1"/>
+        <w:pBdr>
+          <w:top w:space="0" w:sz="0" w:val="nil"/>
+          <w:left w:space="0" w:sz="0" w:val="nil"/>
+          <w:bottom w:space="0" w:sz="0" w:val="nil"/>
+          <w:right w:space="0" w:sz="0" w:val="nil"/>
+          <w:between w:space="0" w:sz="0" w:val="nil"/>
+        </w:pBdr>
+        <w:shd w:fill="auto" w:val="clear"/>
+        <w:spacing w:after="0" w:before="200" w:line="276" w:lineRule="auto"/>
+        <w:ind w:left="0" w:right="0" w:firstLine="0"/>
+        <w:jc w:val="left"/>
+        <w:rPr>
+          <w:rFonts w:ascii="Calibri" w:cs="Calibri" w:eastAsia="Calibri" w:hAnsi="Calibri"/>
+          <w:b w:val="1"/>
+          <w:bCs w:val="1"/>
+          <w:color w:val="4f81bd"/>
+          <w:sz w:val="26"/>
+          <w:szCs w:val="26"/>
+        </w:rPr>
+      </w:pPr>
+      <w:r>
+        <w:rPr>
+          <w:rFonts w:ascii="Calibri" w:cs="Calibri" w:eastAsia="Calibri" w:hAnsi="Calibri"/>
+          <w:b w:val="1"/>
+          <w:bCs w:val="1"/>
+          <w:color w:val="4f81bd"/>
+          <w:sz w:val="26"/>
+          <w:szCs w:val="26"/>
+          <w:rtl w:val="0"/>
+        </w:rPr>
+        <w:t xml:space="preserve">Scenario: Scheduled Periodic Tasks</w:t>
+      </w:r>
+    </w:p>
+    <w:p>
+      <w:pPr>
+        <w:spacing w:after="160" w:line="276" w:lineRule="auto"/>
+        <w:rPr>
+          <w:b w:val="1"/>
+          <w:bCs w:val="1"/>
+          <w:color w:val="006400"/>
+        </w:rPr>
+      </w:pPr>
+      <w:r>
+        <w:rPr>
+          <w:b w:val="1"/>
+          <w:bCs w:val="1"/>
+          <w:rtl w:val="0"/>
+        </w:rPr>
+        <w:t xml:space="preserve">Choice: Celery Beat.</w:t>
+      </w:r>
+      <w:r>
+        <w:rPr>
+          <w:rtl w:val="0"/>
+        </w:rPr>
+        <w:t xml:space="preserve"> Django Tasks has no built-in scheduler (no cron equivalent).</w:t>
+      </w:r>
+      <w:r>
+        <w:rPr>
+          <w:rtl w:val="0"/>
+        </w:rPr>
+      </w:r>
+    </w:p>
+    <w:p>
+      <w:pPr>
+        <w:pStyle w:val="Heading2"/>
+        <w:keepNext w:val="1"/>
+        <w:keepLines w:val="1"/>
+        <w:pageBreakBefore w:val="0"/>
+        <w:widowControl w:val="1"/>
+        <w:pBdr>
+          <w:top w:space="0" w:sz="0" w:val="nil"/>
+          <w:left w:space="0" w:sz="0" w:val="nil"/>
+          <w:bottom w:space="0" w:sz="0" w:val="nil"/>
+          <w:right w:space="0" w:sz="0" w:val="nil"/>
+          <w:between w:space="0" w:sz="0" w:val="nil"/>
+        </w:pBdr>
+        <w:shd w:fill="auto" w:val="clear"/>
+        <w:spacing w:after="0" w:before="200" w:line="276" w:lineRule="auto"/>
+        <w:ind w:left="0" w:right="0" w:firstLine="0"/>
+        <w:jc w:val="left"/>
+        <w:rPr>
+          <w:rFonts w:ascii="Calibri" w:cs="Calibri" w:eastAsia="Calibri" w:hAnsi="Calibri"/>
+          <w:b w:val="1"/>
+          <w:bCs w:val="1"/>
+          <w:color w:val="4f81bd"/>
+          <w:sz w:val="26"/>
+          <w:szCs w:val="26"/>
+        </w:rPr>
+      </w:pPr>
+      <w:r>
+        <w:rPr>
+          <w:b w:val="1"/>
+          <w:bCs w:val="1"/>
+          <w:color w:val="3f6caf"/>
+          <w:rtl w:val="0"/>
+        </w:rPr>
+        <w:t xml:space="preserve">Scenario: Distributed Microservices</w:t>
+      </w:r>
+      <w:r>
+        <w:rPr>
+          <w:rtl w:val="0"/>
+        </w:rPr>
+      </w:r>
+    </w:p>
+    <w:p>
+      <w:pPr>
+        <w:spacing w:after="160" w:line="276" w:lineRule="auto"/>
+        <w:rPr>
+          <w:b w:val="1"/>
+          <w:bCs w:val="1"/>
+          <w:color w:val="006400"/>
+        </w:rPr>
+      </w:pPr>
+      <w:r>
+        <w:rPr>
+          <w:b w:val="1"/>
+          <w:bCs w:val="1"/>
+          <w:rtl w:val="0"/>
+        </w:rPr>
+        <w:t xml:space="preserve">Choice: Celery.</w:t>
+      </w:r>
+      <w:r>
+        <w:rPr>
+          <w:rtl w:val="0"/>
+        </w:rPr>
+        <w:t xml:space="preserve"> Multiple services need shared queue. Django Tasks is single-app only.</w:t>
+      </w:r>
+      <w:r>
+        <w:rPr>
+          <w:rtl w:val="0"/>
+        </w:rPr>
+      </w:r>
+    </w:p>
+    <w:p>
+      <w:pPr>
+        <w:pStyle w:val="Heading2"/>
+        <w:keepNext w:val="1"/>
+        <w:keepLines w:val="1"/>
+        <w:pageBreakBefore w:val="0"/>
+        <w:widowControl w:val="1"/>
+        <w:pBdr>
+          <w:top w:space="0" w:sz="0" w:val="nil"/>
+          <w:left w:space="0" w:sz="0" w:val="nil"/>
+          <w:bottom w:space="0" w:sz="0" w:val="nil"/>
+          <w:right w:space="0" w:sz="0" w:val="nil"/>
+          <w:between w:space="0" w:sz="0" w:val="nil"/>
+        </w:pBdr>
+        <w:shd w:fill="auto" w:val="clear"/>
+        <w:spacing w:after="0" w:before="200" w:line="276" w:lineRule="auto"/>
+        <w:ind w:left="0" w:right="0" w:firstLine="0"/>
+        <w:jc w:val="left"/>
+        <w:rPr>
+          <w:rFonts w:ascii="Calibri" w:cs="Calibri" w:eastAsia="Calibri" w:hAnsi="Calibri"/>
+          <w:b w:val="1"/>
+          <w:bCs w:val="1"/>
+          <w:color w:val="4f81bd"/>
+          <w:sz w:val="26"/>
+          <w:szCs w:val="26"/>
+        </w:rPr>
+      </w:pPr>
+      <w:r>
+        <w:rPr>
+          <w:rFonts w:ascii="Calibri" w:cs="Calibri" w:eastAsia="Calibri" w:hAnsi="Calibri"/>
+          <w:b w:val="1"/>
+          <w:bCs w:val="1"/>
+          <w:color w:val="4f81bd"/>
+          <w:sz w:val="26"/>
+          <w:szCs w:val="26"/>
+          <w:rtl w:val="0"/>
+        </w:rPr>
+        <w:t xml:space="preserve">Scenario: High-Frequency Stock Updates</w:t>
+      </w:r>
+    </w:p>
+    <w:p>
+      <w:pPr>
+        <w:keepNext w:val="0"/>
+        <w:keepLines w:val="0"/>
+        <w:pageBreakBefore w:val="0"/>
+        <w:widowControl w:val="1"/>
+        <w:pBdr>
+          <w:top w:space="0" w:sz="0" w:val="nil"/>
+          <w:left w:space="0" w:sz="0" w:val="nil"/>
+          <w:bottom w:space="0" w:sz="0" w:val="nil"/>
+          <w:right w:space="0" w:sz="0" w:val="nil"/>
+          <w:between w:space="0" w:sz="0" w:val="nil"/>
+        </w:pBdr>
+        <w:shd w:fill="auto" w:val="clear"/>
+        <w:spacing w:after="200" w:before="0" w:line="276" w:lineRule="auto"/>
+        <w:ind w:left="0" w:right="0" w:firstLine="0"/>
+        <w:jc w:val="left"/>
+        <w:rPr/>
+      </w:pPr>
+      <w:r>
+        <w:rPr>
+          <w:b w:val="1"/>
+          <w:bCs w:val="1"/>
+          <w:rtl w:val="0"/>
+        </w:rPr>
+        <w:t xml:space="preserve">Choice: Celery.</w:t>
+      </w:r>
+      <w:r>
+        <w:rPr>
+          <w:rtl w:val="0"/>
+        </w:rPr>
+        <w:t xml:space="preserve"> 10k+ updates/sec requires in-memory broker. DB can't handle write volume.</w:t>
+      </w:r>
+    </w:p>
+    <w:p>
+      <w:pPr>
+        <w:pStyle w:val="Heading1"/>
+        <w:keepNext w:val="1"/>
+        <w:keepLines w:val="1"/>
+        <w:pageBreakBefore w:val="0"/>
+        <w:widowControl w:val="1"/>
+        <w:pBdr>
+          <w:top w:space="0" w:sz="0" w:val="nil"/>
+          <w:left w:space="0" w:sz="0" w:val="nil"/>
+          <w:bottom w:space="0" w:sz="0" w:val="nil"/>
+          <w:right w:space="0" w:sz="0" w:val="nil"/>
+          <w:between w:space="0" w:sz="0" w:val="nil"/>
+        </w:pBdr>
+        <w:shd w:fill="auto" w:val="clear"/>
+        <w:spacing w:after="0" w:before="480" w:line="276" w:lineRule="auto"/>
+        <w:ind w:left="0" w:right="0" w:firstLine="0"/>
+        <w:jc w:val="left"/>
+        <w:rPr>
+          <w:rFonts w:ascii="Calibri" w:cs="Calibri" w:eastAsia="Calibri" w:hAnsi="Calibri"/>
+          <w:b w:val="1"/>
+          <w:bCs w:val="1"/>
+          <w:color w:val="366091"/>
+          <w:sz w:val="28"/>
+          <w:szCs w:val="28"/>
+        </w:rPr>
+      </w:pPr>
+      <w:r>
+        <w:rPr>
+          <w:rtl w:val="0"/>
+        </w:rPr>
+        <w:t xml:space="preserve">9. Django Tasks Execution Limits &amp; Constraints</w:t>
+      </w:r>
+      <w:r>
+        <w:rPr>
+          <w:rtl w:val="0"/>
+        </w:rPr>
+      </w:r>
+    </w:p>
+    <w:p>
+      <w:pPr>
+        <w:pStyle w:val="Heading2"/>
+        <w:keepNext w:val="1"/>
+        <w:keepLines w:val="1"/>
+        <w:pageBreakBefore w:val="0"/>
+        <w:widowControl w:val="1"/>
+        <w:pBdr>
+          <w:top w:space="0" w:sz="0" w:val="nil"/>
+          <w:left w:space="0" w:sz="0" w:val="nil"/>
+          <w:bottom w:space="0" w:sz="0" w:val="nil"/>
+          <w:right w:space="0" w:sz="0" w:val="nil"/>
+          <w:between w:space="0" w:sz="0" w:val="nil"/>
+        </w:pBdr>
+        <w:shd w:fill="auto" w:val="clear"/>
+        <w:spacing w:after="0" w:before="200" w:line="276" w:lineRule="auto"/>
+        <w:ind w:left="0" w:right="0" w:firstLine="0"/>
+        <w:jc w:val="left"/>
+        <w:rPr>
+          <w:rFonts w:ascii="Calibri" w:cs="Calibri" w:eastAsia="Calibri" w:hAnsi="Calibri"/>
+          <w:b w:val="1"/>
+          <w:bCs w:val="1"/>
+          <w:color w:val="4f81bd"/>
+          <w:sz w:val="26"/>
+          <w:szCs w:val="26"/>
+        </w:rPr>
+      </w:pPr>
+      <w:r>
+        <w:rPr>
+          <w:rFonts w:ascii="Calibri" w:cs="Calibri" w:eastAsia="Calibri" w:hAnsi="Calibri"/>
+          <w:b w:val="1"/>
+          <w:bCs w:val="1"/>
+          <w:color w:val="4f81bd"/>
+          <w:sz w:val="26"/>
+          <w:szCs w:val="26"/>
+          <w:rtl w:val="0"/>
+        </w:rPr>
+        <w:t xml:space="preserve">Task Execution Time Limits:</w:t>
+      </w:r>
+    </w:p>
+    <w:p>
+      <w:pPr>
+        <w:keepNext w:val="0"/>
+        <w:keepLines w:val="0"/>
+        <w:pageBreakBefore w:val="0"/>
+        <w:widowControl w:val="1"/>
+        <w:numPr>
+          <w:ilvl w:val="0"/>
+          <w:numId w:val="2"/>
+        </w:numPr>
+        <w:pBdr>
+          <w:top w:space="0" w:sz="0" w:val="nil"/>
+          <w:left w:space="0" w:sz="0" w:val="nil"/>
+          <w:bottom w:space="0" w:sz="0" w:val="nil"/>
+          <w:right w:space="0" w:sz="0" w:val="nil"/>
+          <w:between w:space="0" w:sz="0" w:val="nil"/>
+        </w:pBdr>
+        <w:shd w:fill="auto" w:val="clear"/>
+        <w:spacing w:after="0" w:afterAutospacing="0" w:before="0" w:line="276" w:lineRule="auto"/>
+        <w:ind w:left="720" w:right="0" w:hanging="360"/>
+        <w:jc w:val="left"/>
+        <w:rPr>
+          <w:u w:val="none"/>
+        </w:rPr>
+      </w:pPr>
+      <w:r>
+        <w:rPr>
+          <w:rtl w:val="0"/>
+        </w:rPr>
+        <w:t xml:space="preserve">No Built-in Timeout: Runaway tasks can block workers indefinitely.</w:t>
+      </w:r>
+    </w:p>
+    <w:p>
+      <w:pPr>
+        <w:keepNext w:val="0"/>
+        <w:keepLines w:val="0"/>
+        <w:pageBreakBefore w:val="0"/>
+        <w:widowControl w:val="1"/>
+        <w:numPr>
+          <w:ilvl w:val="0"/>
+          <w:numId w:val="2"/>
+        </w:numPr>
+        <w:pBdr>
+          <w:top w:space="0" w:sz="0" w:val="nil"/>
+          <w:left w:space="0" w:sz="0" w:val="nil"/>
+          <w:bottom w:space="0" w:sz="0" w:val="nil"/>
+          <w:right w:space="0" w:sz="0" w:val="nil"/>
+          <w:between w:space="0" w:sz="0" w:val="nil"/>
+        </w:pBdr>
+        <w:shd w:fill="auto" w:val="clear"/>
+        <w:spacing w:after="200" w:before="0" w:line="276" w:lineRule="auto"/>
+        <w:ind w:left="720" w:right="0" w:hanging="360"/>
+        <w:jc w:val="left"/>
+        <w:rPr>
+          <w:u w:val="none"/>
+        </w:rPr>
+      </w:pPr>
+      <w:r>
+        <w:rPr>
+          <w:rtl w:val="0"/>
+        </w:rPr>
+        <w:t xml:space="preserve">Celery Advantage: Built-in task_time_limit and task_soft_time_limit.</w:t>
+      </w:r>
+    </w:p>
+    <w:p>
+      <w:pPr>
+        <w:pStyle w:val="Heading2"/>
+        <w:keepNext w:val="1"/>
+        <w:keepLines w:val="1"/>
+        <w:pageBreakBefore w:val="0"/>
+        <w:widowControl w:val="1"/>
+        <w:pBdr>
+          <w:top w:space="0" w:sz="0" w:val="nil"/>
+          <w:left w:space="0" w:sz="0" w:val="nil"/>
+          <w:bottom w:space="0" w:sz="0" w:val="nil"/>
+          <w:right w:space="0" w:sz="0" w:val="nil"/>
+          <w:between w:space="0" w:sz="0" w:val="nil"/>
+        </w:pBdr>
+        <w:shd w:fill="auto" w:val="clear"/>
+        <w:spacing w:after="0" w:before="200" w:line="276" w:lineRule="auto"/>
+        <w:ind w:left="0" w:right="0" w:firstLine="0"/>
+        <w:jc w:val="left"/>
+        <w:rPr>
+          <w:rFonts w:ascii="Calibri" w:cs="Calibri" w:eastAsia="Calibri" w:hAnsi="Calibri"/>
+          <w:b w:val="1"/>
+          <w:bCs w:val="1"/>
+          <w:color w:val="4f81bd"/>
+          <w:sz w:val="26"/>
+          <w:szCs w:val="26"/>
+        </w:rPr>
+      </w:pPr>
+      <w:r>
+        <w:rPr>
+          <w:rFonts w:ascii="Calibri" w:cs="Calibri" w:eastAsia="Calibri" w:hAnsi="Calibri"/>
+          <w:b w:val="1"/>
+          <w:bCs w:val="1"/>
+          <w:color w:val="4f81bd"/>
+          <w:sz w:val="26"/>
+          <w:szCs w:val="26"/>
+          <w:rtl w:val="0"/>
+        </w:rPr>
+        <w:t xml:space="preserve">Task Retention &amp; Queue Depth:</w:t>
+      </w:r>
+    </w:p>
+    <w:p>
+      <w:pPr>
+        <w:keepNext w:val="0"/>
+        <w:keepLines w:val="0"/>
+        <w:pageBreakBefore w:val="0"/>
+        <w:widowControl w:val="1"/>
         <w:numPr>
           <w:ilvl w:val="0"/>
           <w:numId w:val="1"/>
         </w:numPr>
-        <w:spacing w:after="0" w:lineRule="auto"/>
-        <w:ind w:left="360"/>
-        <w:rPr>
-          <w:b w:val="0"/>
-          <w:bCs w:val="0"/>
-          <w:color w:val="000000"/>
-          <w:sz w:val="22"/>
-          <w:szCs w:val="22"/>
-        </w:rPr>
-      </w:pPr>
-      <w:r>
-        <w:rPr>
-          <w:b w:val="1"/>
-          <w:bCs w:val="1"/>
-          <w:rtl w:val="0"/>
-        </w:rPr>
-        <w:t xml:space="preserve">Database Contention</w:t>
-      </w:r>
-      <w:r>
-        <w:rPr>
-          <w:rtl w:val="0"/>
-        </w:rPr>
-        <w:t xml:space="preserve">: Django Tasks handled bulk operations well, but as task volume increases, "Enqueue Latency" rises because it competes with application writes.</w:t>
-      </w:r>
-    </w:p>
-    <w:p>
-      <w:pPr>
+        <w:pBdr>
+          <w:top w:space="0" w:sz="0" w:val="nil"/>
+          <w:left w:space="0" w:sz="0" w:val="nil"/>
+          <w:bottom w:space="0" w:sz="0" w:val="nil"/>
+          <w:right w:space="0" w:sz="0" w:val="nil"/>
+          <w:between w:space="0" w:sz="0" w:val="nil"/>
+        </w:pBdr>
+        <w:shd w:fill="auto" w:val="clear"/>
+        <w:spacing w:after="0" w:afterAutospacing="0" w:before="0" w:line="276" w:lineRule="auto"/>
+        <w:ind w:left="720" w:right="0" w:hanging="360"/>
+        <w:jc w:val="left"/>
+        <w:rPr>
+          <w:u w:val="none"/>
+        </w:rPr>
+      </w:pPr>
+      <w:r>
+        <w:rPr>
+          <w:rtl w:val="0"/>
+        </w:rPr>
+        <w:t xml:space="preserve">Database Storage: 1M pending tasks = 1M database rows (causes index bloat).</w:t>
+      </w:r>
+    </w:p>
+    <w:p>
+      <w:pPr>
+        <w:keepNext w:val="0"/>
+        <w:keepLines w:val="0"/>
+        <w:pageBreakBefore w:val="0"/>
+        <w:widowControl w:val="1"/>
         <w:numPr>
           <w:ilvl w:val="0"/>
           <w:numId w:val="1"/>
         </w:numPr>
-        <w:ind w:left="360"/>
-        <w:rPr>
-          <w:b w:val="0"/>
-          <w:bCs w:val="0"/>
-          <w:color w:val="000000"/>
-          <w:sz w:val="22"/>
-          <w:szCs w:val="22"/>
-        </w:rPr>
-      </w:pPr>
-      <w:r>
-        <w:rPr>
-          <w:b w:val="1"/>
-          <w:bCs w:val="1"/>
-          <w:rtl w:val="0"/>
-        </w:rPr>
-        <w:t xml:space="preserve">HTTP Fan-out</w:t>
-      </w:r>
-      <w:r>
-        <w:rPr>
-          <w:rtl w:val="0"/>
-        </w:rPr>
-        <w:t xml:space="preserve">: Both systems handled thread-based fan-out identically, showing that for network-bound tasks, the broker choice is less critical than worker concurrency.</w:t>
+        <w:pBdr>
+          <w:top w:space="0" w:sz="0" w:val="nil"/>
+          <w:left w:space="0" w:sz="0" w:val="nil"/>
+          <w:bottom w:space="0" w:sz="0" w:val="nil"/>
+          <w:right w:space="0" w:sz="0" w:val="nil"/>
+          <w:between w:space="0" w:sz="0" w:val="nil"/>
+        </w:pBdr>
+        <w:shd w:fill="auto" w:val="clear"/>
+        <w:spacing w:after="200" w:before="0" w:line="276" w:lineRule="auto"/>
+        <w:ind w:left="720" w:right="0" w:hanging="360"/>
+        <w:jc w:val="left"/>
+        <w:rPr>
+          <w:u w:val="none"/>
+        </w:rPr>
+      </w:pPr>
+      <w:r>
+        <w:rPr>
+          <w:rtl w:val="0"/>
+        </w:rPr>
+        <w:t xml:space="preserve">Celery Advantage: In-memory storage with automatic expiration.</w:t>
+      </w:r>
+    </w:p>
+    <w:p>
+      <w:pPr>
+        <w:pStyle w:val="Heading2"/>
+        <w:keepNext w:val="1"/>
+        <w:keepLines w:val="1"/>
+        <w:pageBreakBefore w:val="0"/>
+        <w:widowControl w:val="1"/>
+        <w:pBdr>
+          <w:top w:space="0" w:sz="0" w:val="nil"/>
+          <w:left w:space="0" w:sz="0" w:val="nil"/>
+          <w:bottom w:space="0" w:sz="0" w:val="nil"/>
+          <w:right w:space="0" w:sz="0" w:val="nil"/>
+          <w:between w:space="0" w:sz="0" w:val="nil"/>
+        </w:pBdr>
+        <w:shd w:fill="auto" w:val="clear"/>
+        <w:spacing w:after="0" w:before="200" w:line="276" w:lineRule="auto"/>
+        <w:ind w:left="0" w:right="0" w:firstLine="0"/>
+        <w:jc w:val="left"/>
+        <w:rPr>
+          <w:rFonts w:ascii="Calibri" w:cs="Calibri" w:eastAsia="Calibri" w:hAnsi="Calibri"/>
+          <w:b w:val="1"/>
+          <w:bCs w:val="1"/>
+          <w:color w:val="4f81bd"/>
+          <w:sz w:val="26"/>
+          <w:szCs w:val="26"/>
+        </w:rPr>
+      </w:pPr>
+      <w:r>
+        <w:rPr>
+          <w:rFonts w:ascii="Calibri" w:cs="Calibri" w:eastAsia="Calibri" w:hAnsi="Calibri"/>
+          <w:b w:val="1"/>
+          <w:bCs w:val="1"/>
+          <w:color w:val="4f81bd"/>
+          <w:sz w:val="26"/>
+          <w:szCs w:val="26"/>
+          <w:rtl w:val="0"/>
+        </w:rPr>
+        <w:t xml:space="preserve">Concurrency Limits:</w:t>
+      </w:r>
+    </w:p>
+    <w:p>
+      <w:pPr>
+        <w:keepNext w:val="0"/>
+        <w:keepLines w:val="0"/>
+        <w:pageBreakBefore w:val="0"/>
+        <w:widowControl w:val="1"/>
+        <w:numPr>
+          <w:ilvl w:val="0"/>
+          <w:numId w:val="8"/>
+        </w:numPr>
+        <w:pBdr>
+          <w:top w:space="0" w:sz="0" w:val="nil"/>
+          <w:left w:space="0" w:sz="0" w:val="nil"/>
+          <w:bottom w:space="0" w:sz="0" w:val="nil"/>
+          <w:right w:space="0" w:sz="0" w:val="nil"/>
+          <w:between w:space="0" w:sz="0" w:val="nil"/>
+        </w:pBdr>
+        <w:shd w:fill="auto" w:val="clear"/>
+        <w:spacing w:after="0" w:afterAutospacing="0" w:before="0" w:line="276" w:lineRule="auto"/>
+        <w:ind w:left="720" w:right="0" w:hanging="360"/>
+        <w:jc w:val="left"/>
+        <w:rPr>
+          <w:u w:val="none"/>
+        </w:rPr>
+      </w:pPr>
+      <w:r>
+        <w:rPr>
+          <w:rtl w:val="0"/>
+        </w:rPr>
+        <w:t xml:space="preserve">Worker Scaling: Manual process management across servers.</w:t>
+      </w:r>
+    </w:p>
+    <w:p>
+      <w:pPr>
+        <w:keepNext w:val="0"/>
+        <w:keepLines w:val="0"/>
+        <w:pageBreakBefore w:val="0"/>
+        <w:widowControl w:val="1"/>
+        <w:numPr>
+          <w:ilvl w:val="0"/>
+          <w:numId w:val="8"/>
+        </w:numPr>
+        <w:pBdr>
+          <w:top w:space="0" w:sz="0" w:val="nil"/>
+          <w:left w:space="0" w:sz="0" w:val="nil"/>
+          <w:bottom w:space="0" w:sz="0" w:val="nil"/>
+          <w:right w:space="0" w:sz="0" w:val="nil"/>
+          <w:between w:space="0" w:sz="0" w:val="nil"/>
+        </w:pBdr>
+        <w:shd w:fill="auto" w:val="clear"/>
+        <w:spacing w:after="200" w:before="0" w:line="276" w:lineRule="auto"/>
+        <w:ind w:left="720" w:right="0" w:hanging="360"/>
+        <w:jc w:val="left"/>
+        <w:rPr>
+          <w:u w:val="none"/>
+        </w:rPr>
+      </w:pPr>
+      <w:r>
+        <w:rPr>
+          <w:rtl w:val="0"/>
+        </w:rPr>
+        <w:t xml:space="preserve">Celery Advantage: Auto-discovery and autoscale=10,3 for dynamic scaling.</w:t>
+      </w:r>
+    </w:p>
+    <w:p>
+      <w:pPr>
+        <w:pStyle w:val="Heading1"/>
+        <w:keepNext w:val="1"/>
+        <w:keepLines w:val="1"/>
+        <w:pageBreakBefore w:val="0"/>
+        <w:widowControl w:val="1"/>
+        <w:pBdr>
+          <w:top w:space="0" w:sz="0" w:val="nil"/>
+          <w:left w:space="0" w:sz="0" w:val="nil"/>
+          <w:bottom w:space="0" w:sz="0" w:val="nil"/>
+          <w:right w:space="0" w:sz="0" w:val="nil"/>
+          <w:between w:space="0" w:sz="0" w:val="nil"/>
+        </w:pBdr>
+        <w:shd w:fill="auto" w:val="clear"/>
+        <w:spacing w:after="0" w:before="480" w:line="276" w:lineRule="auto"/>
+        <w:ind w:left="0" w:right="0" w:firstLine="0"/>
+        <w:jc w:val="left"/>
+        <w:rPr>
+          <w:rFonts w:ascii="Calibri" w:cs="Calibri" w:eastAsia="Calibri" w:hAnsi="Calibri"/>
+          <w:b w:val="1"/>
+          <w:bCs w:val="1"/>
+          <w:color w:val="366091"/>
+          <w:sz w:val="28"/>
+          <w:szCs w:val="28"/>
+        </w:rPr>
+      </w:pPr>
+      <w:r>
+        <w:rPr>
+          <w:rFonts w:ascii="Calibri" w:cs="Calibri" w:eastAsia="Calibri" w:hAnsi="Calibri"/>
+          <w:b w:val="1"/>
+          <w:bCs w:val="1"/>
+          <w:color w:val="366091"/>
+          <w:sz w:val="28"/>
+          <w:szCs w:val="28"/>
+          <w:rtl w:val="0"/>
+        </w:rPr>
+        <w:t xml:space="preserve">10. Overall Verdict &amp; Recommendation</w:t>
+      </w:r>
+    </w:p>
+    <w:p>
+      <w:pPr>
+        <w:pStyle w:val="Heading2"/>
+        <w:keepNext w:val="1"/>
+        <w:keepLines w:val="1"/>
+        <w:pageBreakBefore w:val="0"/>
+        <w:widowControl w:val="1"/>
+        <w:pBdr>
+          <w:top w:space="0" w:sz="0" w:val="nil"/>
+          <w:left w:space="0" w:sz="0" w:val="nil"/>
+          <w:bottom w:space="0" w:sz="0" w:val="nil"/>
+          <w:right w:space="0" w:sz="0" w:val="nil"/>
+          <w:between w:space="0" w:sz="0" w:val="nil"/>
+        </w:pBdr>
+        <w:shd w:fill="auto" w:val="clear"/>
+        <w:spacing w:after="0" w:before="200" w:line="276" w:lineRule="auto"/>
+        <w:ind w:left="0" w:right="0" w:firstLine="0"/>
+        <w:jc w:val="left"/>
+        <w:rPr>
+          <w:rFonts w:ascii="Calibri" w:cs="Calibri" w:eastAsia="Calibri" w:hAnsi="Calibri"/>
+          <w:b w:val="1"/>
+          <w:bCs w:val="1"/>
+          <w:color w:val="4f81bd"/>
+          <w:sz w:val="26"/>
+          <w:szCs w:val="26"/>
+        </w:rPr>
+      </w:pPr>
+      <w:r>
+        <w:rPr>
+          <w:rFonts w:ascii="Calibri" w:cs="Calibri" w:eastAsia="Calibri" w:hAnsi="Calibri"/>
+          <w:b w:val="1"/>
+          <w:bCs w:val="1"/>
+          <w:color w:val="4f81bd"/>
+          <w:sz w:val="26"/>
+          <w:szCs w:val="26"/>
+          <w:rtl w:val="0"/>
+        </w:rPr>
+        <w:t xml:space="preserve">When to Use Django Tasks:</w:t>
+      </w:r>
+    </w:p>
+    <w:p>
+      <w:pPr>
+        <w:keepNext w:val="0"/>
+        <w:keepLines w:val="0"/>
+        <w:pageBreakBefore w:val="0"/>
+        <w:widowControl w:val="1"/>
+        <w:numPr>
+          <w:ilvl w:val="0"/>
+          <w:numId w:val="7"/>
+        </w:numPr>
+        <w:pBdr>
+          <w:top w:space="0" w:sz="0" w:val="nil"/>
+          <w:left w:space="0" w:sz="0" w:val="nil"/>
+          <w:bottom w:space="0" w:sz="0" w:val="nil"/>
+          <w:right w:space="0" w:sz="0" w:val="nil"/>
+          <w:between w:space="0" w:sz="0" w:val="nil"/>
+        </w:pBdr>
+        <w:shd w:fill="auto" w:val="clear"/>
+        <w:spacing w:after="0" w:afterAutospacing="0" w:before="0" w:line="276" w:lineRule="auto"/>
+        <w:ind w:left="720" w:right="0" w:hanging="360"/>
+        <w:jc w:val="left"/>
+        <w:rPr>
+          <w:u w:val="none"/>
+        </w:rPr>
+      </w:pPr>
+      <w:r>
+        <w:rPr>
+          <w:rtl w:val="0"/>
+        </w:rPr>
+        <w:t xml:space="preserve">Transactional emails (sign-up, password reset)</w:t>
+      </w:r>
+    </w:p>
+    <w:p>
+      <w:pPr>
+        <w:keepNext w:val="0"/>
+        <w:keepLines w:val="0"/>
+        <w:pageBreakBefore w:val="0"/>
+        <w:widowControl w:val="1"/>
+        <w:numPr>
+          <w:ilvl w:val="0"/>
+          <w:numId w:val="7"/>
+        </w:numPr>
+        <w:pBdr>
+          <w:top w:space="0" w:sz="0" w:val="nil"/>
+          <w:left w:space="0" w:sz="0" w:val="nil"/>
+          <w:bottom w:space="0" w:sz="0" w:val="nil"/>
+          <w:right w:space="0" w:sz="0" w:val="nil"/>
+          <w:between w:space="0" w:sz="0" w:val="nil"/>
+        </w:pBdr>
+        <w:shd w:fill="auto" w:val="clear"/>
+        <w:spacing w:after="0" w:afterAutospacing="0" w:before="0" w:line="276" w:lineRule="auto"/>
+        <w:ind w:left="720" w:right="0" w:hanging="360"/>
+        <w:jc w:val="left"/>
+        <w:rPr>
+          <w:u w:val="none"/>
+        </w:rPr>
+      </w:pPr>
+      <w:r>
+        <w:rPr>
+          <w:rtl w:val="0"/>
+        </w:rPr>
+        <w:t xml:space="preserve">Report generation (&lt; 5 min execution)</w:t>
+      </w:r>
+    </w:p>
+    <w:p>
+      <w:pPr>
+        <w:keepNext w:val="0"/>
+        <w:keepLines w:val="0"/>
+        <w:pageBreakBefore w:val="0"/>
+        <w:widowControl w:val="1"/>
+        <w:numPr>
+          <w:ilvl w:val="0"/>
+          <w:numId w:val="7"/>
+        </w:numPr>
+        <w:pBdr>
+          <w:top w:space="0" w:sz="0" w:val="nil"/>
+          <w:left w:space="0" w:sz="0" w:val="nil"/>
+          <w:bottom w:space="0" w:sz="0" w:val="nil"/>
+          <w:right w:space="0" w:sz="0" w:val="nil"/>
+          <w:between w:space="0" w:sz="0" w:val="nil"/>
+        </w:pBdr>
+        <w:shd w:fill="auto" w:val="clear"/>
+        <w:spacing w:after="0" w:afterAutospacing="0" w:before="0" w:line="276" w:lineRule="auto"/>
+        <w:ind w:left="720" w:right="0" w:hanging="360"/>
+        <w:jc w:val="left"/>
+        <w:rPr>
+          <w:u w:val="none"/>
+        </w:rPr>
+      </w:pPr>
+      <w:r>
+        <w:rPr>
+          <w:rtl w:val="0"/>
+        </w:rPr>
+        <w:t xml:space="preserve">Webhook callbacks (&lt; 1000/hour)</w:t>
+      </w:r>
+    </w:p>
+    <w:p>
+      <w:pPr>
+        <w:keepNext w:val="0"/>
+        <w:keepLines w:val="0"/>
+        <w:pageBreakBefore w:val="0"/>
+        <w:widowControl w:val="1"/>
+        <w:numPr>
+          <w:ilvl w:val="0"/>
+          <w:numId w:val="7"/>
+        </w:numPr>
+        <w:pBdr>
+          <w:top w:space="0" w:sz="0" w:val="nil"/>
+          <w:left w:space="0" w:sz="0" w:val="nil"/>
+          <w:bottom w:space="0" w:sz="0" w:val="nil"/>
+          <w:right w:space="0" w:sz="0" w:val="nil"/>
+          <w:between w:space="0" w:sz="0" w:val="nil"/>
+        </w:pBdr>
+        <w:shd w:fill="auto" w:val="clear"/>
+        <w:spacing w:after="200" w:before="0" w:line="276" w:lineRule="auto"/>
+        <w:ind w:left="720" w:right="0" w:hanging="360"/>
+        <w:jc w:val="left"/>
+        <w:rPr>
+          <w:u w:val="none"/>
+        </w:rPr>
+      </w:pPr>
+      <w:r>
+        <w:rPr>
+          <w:rtl w:val="0"/>
+        </w:rPr>
+        <w:t xml:space="preserve">Background cleanup jobs</w:t>
+      </w:r>
+    </w:p>
+    <w:p>
+      <w:pPr>
+        <w:pStyle w:val="Heading2"/>
+        <w:keepNext w:val="1"/>
+        <w:keepLines w:val="1"/>
+        <w:pageBreakBefore w:val="0"/>
+        <w:widowControl w:val="1"/>
+        <w:pBdr>
+          <w:top w:space="0" w:sz="0" w:val="nil"/>
+          <w:left w:space="0" w:sz="0" w:val="nil"/>
+          <w:bottom w:space="0" w:sz="0" w:val="nil"/>
+          <w:right w:space="0" w:sz="0" w:val="nil"/>
+          <w:between w:space="0" w:sz="0" w:val="nil"/>
+        </w:pBdr>
+        <w:shd w:fill="auto" w:val="clear"/>
+        <w:spacing w:after="0" w:before="200" w:line="276" w:lineRule="auto"/>
+        <w:ind w:left="0" w:right="0" w:firstLine="0"/>
+        <w:jc w:val="left"/>
+        <w:rPr>
+          <w:rFonts w:ascii="Calibri" w:cs="Calibri" w:eastAsia="Calibri" w:hAnsi="Calibri"/>
+          <w:b w:val="1"/>
+          <w:bCs w:val="1"/>
+          <w:color w:val="4f81bd"/>
+          <w:sz w:val="26"/>
+          <w:szCs w:val="26"/>
+        </w:rPr>
+      </w:pPr>
+      <w:r>
+        <w:rPr>
+          <w:rFonts w:ascii="Calibri" w:cs="Calibri" w:eastAsia="Calibri" w:hAnsi="Calibri"/>
+          <w:b w:val="1"/>
+          <w:bCs w:val="1"/>
+          <w:color w:val="4f81bd"/>
+          <w:sz w:val="26"/>
+          <w:szCs w:val="26"/>
+          <w:rtl w:val="0"/>
+        </w:rPr>
+        <w:t xml:space="preserve">When to Use Celery:</w:t>
+      </w:r>
+    </w:p>
+    <w:p>
+      <w:pPr>
+        <w:keepNext w:val="0"/>
+        <w:keepLines w:val="0"/>
+        <w:pageBreakBefore w:val="0"/>
+        <w:widowControl w:val="1"/>
+        <w:numPr>
+          <w:ilvl w:val="0"/>
+          <w:numId w:val="6"/>
+        </w:numPr>
+        <w:pBdr>
+          <w:top w:space="0" w:sz="0" w:val="nil"/>
+          <w:left w:space="0" w:sz="0" w:val="nil"/>
+          <w:bottom w:space="0" w:sz="0" w:val="nil"/>
+          <w:right w:space="0" w:sz="0" w:val="nil"/>
+          <w:between w:space="0" w:sz="0" w:val="nil"/>
+        </w:pBdr>
+        <w:shd w:fill="auto" w:val="clear"/>
+        <w:spacing w:after="0" w:afterAutospacing="0" w:before="0" w:line="276" w:lineRule="auto"/>
+        <w:ind w:left="720" w:right="0" w:hanging="360"/>
+        <w:jc w:val="left"/>
+        <w:rPr>
+          <w:u w:val="none"/>
+        </w:rPr>
+      </w:pPr>
+      <w:r>
+        <w:rPr>
+          <w:rtl w:val="0"/>
+        </w:rPr>
+        <w:t xml:space="preserve">Real-time notifications (chat, alerts)</w:t>
+      </w:r>
+    </w:p>
+    <w:p>
+      <w:pPr>
+        <w:keepNext w:val="0"/>
+        <w:keepLines w:val="0"/>
+        <w:pageBreakBefore w:val="0"/>
+        <w:widowControl w:val="1"/>
+        <w:numPr>
+          <w:ilvl w:val="0"/>
+          <w:numId w:val="6"/>
+        </w:numPr>
+        <w:pBdr>
+          <w:top w:space="0" w:sz="0" w:val="nil"/>
+          <w:left w:space="0" w:sz="0" w:val="nil"/>
+          <w:bottom w:space="0" w:sz="0" w:val="nil"/>
+          <w:right w:space="0" w:sz="0" w:val="nil"/>
+          <w:between w:space="0" w:sz="0" w:val="nil"/>
+        </w:pBdr>
+        <w:shd w:fill="auto" w:val="clear"/>
+        <w:spacing w:after="0" w:afterAutospacing="0" w:before="0" w:line="276" w:lineRule="auto"/>
+        <w:ind w:left="720" w:right="0" w:hanging="360"/>
+        <w:jc w:val="left"/>
+        <w:rPr>
+          <w:u w:val="none"/>
+        </w:rPr>
+      </w:pPr>
+      <w:r>
+        <w:rPr>
+          <w:rtl w:val="0"/>
+        </w:rPr>
+        <w:t xml:space="preserve">Video/image processing pipelines</w:t>
+      </w:r>
+      <w:r>
+        <w:rPr>
+          <w:rtl w:val="0"/>
+        </w:rPr>
+      </w:r>
+    </w:p>
+    <w:p>
+      <w:pPr>
+        <w:keepNext w:val="0"/>
+        <w:keepLines w:val="0"/>
+        <w:pageBreakBefore w:val="0"/>
+        <w:widowControl w:val="1"/>
+        <w:numPr>
+          <w:ilvl w:val="0"/>
+          <w:numId w:val="6"/>
+        </w:numPr>
+        <w:pBdr>
+          <w:top w:space="0" w:sz="0" w:val="nil"/>
+          <w:left w:space="0" w:sz="0" w:val="nil"/>
+          <w:bottom w:space="0" w:sz="0" w:val="nil"/>
+          <w:right w:space="0" w:sz="0" w:val="nil"/>
+          <w:between w:space="0" w:sz="0" w:val="nil"/>
+        </w:pBdr>
+        <w:shd w:fill="auto" w:val="clear"/>
+        <w:spacing w:after="0" w:afterAutospacing="0" w:before="0" w:line="276" w:lineRule="auto"/>
+        <w:ind w:left="720" w:right="0" w:hanging="360"/>
+        <w:jc w:val="left"/>
+        <w:rPr>
+          <w:u w:val="none"/>
+        </w:rPr>
+      </w:pPr>
+      <w:r>
+        <w:rPr>
+          <w:rtl w:val="0"/>
+        </w:rPr>
+        <w:t xml:space="preserve">Scheduled periodic tasks (cron jobs)</w:t>
+      </w:r>
+    </w:p>
+    <w:p>
+      <w:pPr>
+        <w:keepNext w:val="0"/>
+        <w:keepLines w:val="0"/>
+        <w:pageBreakBefore w:val="0"/>
+        <w:widowControl w:val="1"/>
+        <w:numPr>
+          <w:ilvl w:val="0"/>
+          <w:numId w:val="6"/>
+        </w:numPr>
+        <w:pBdr>
+          <w:top w:space="0" w:sz="0" w:val="nil"/>
+          <w:left w:space="0" w:sz="0" w:val="nil"/>
+          <w:bottom w:space="0" w:sz="0" w:val="nil"/>
+          <w:right w:space="0" w:sz="0" w:val="nil"/>
+          <w:between w:space="0" w:sz="0" w:val="nil"/>
+        </w:pBdr>
+        <w:shd w:fill="auto" w:val="clear"/>
+        <w:spacing w:after="0" w:afterAutospacing="0" w:before="0" w:line="276" w:lineRule="auto"/>
+        <w:ind w:left="720" w:right="0" w:hanging="360"/>
+        <w:jc w:val="left"/>
+        <w:rPr>
+          <w:u w:val="none"/>
+        </w:rPr>
+      </w:pPr>
+      <w:r>
+        <w:rPr>
+          <w:rtl w:val="0"/>
+        </w:rPr>
+        <w:t xml:space="preserve">Distributed microservices</w:t>
+      </w:r>
+    </w:p>
+    <w:p>
+      <w:pPr>
+        <w:keepNext w:val="0"/>
+        <w:keepLines w:val="0"/>
+        <w:pageBreakBefore w:val="0"/>
+        <w:widowControl w:val="1"/>
+        <w:numPr>
+          <w:ilvl w:val="0"/>
+          <w:numId w:val="6"/>
+        </w:numPr>
+        <w:pBdr>
+          <w:top w:space="0" w:sz="0" w:val="nil"/>
+          <w:left w:space="0" w:sz="0" w:val="nil"/>
+          <w:bottom w:space="0" w:sz="0" w:val="nil"/>
+          <w:right w:space="0" w:sz="0" w:val="nil"/>
+          <w:between w:space="0" w:sz="0" w:val="nil"/>
+        </w:pBdr>
+        <w:shd w:fill="auto" w:val="clear"/>
+        <w:spacing w:after="200" w:before="0" w:line="276" w:lineRule="auto"/>
+        <w:ind w:left="720" w:right="0" w:hanging="360"/>
+        <w:jc w:val="left"/>
+        <w:rPr>
+          <w:u w:val="none"/>
+        </w:rPr>
+      </w:pPr>
+      <w:r>
+        <w:rPr>
+          <w:rtl w:val="0"/>
+        </w:rPr>
+        <w:t xml:space="preserve">High-frequency tasks (&gt;1000/sec)</w:t>
+      </w:r>
+    </w:p>
+    <w:p>
+      <w:pPr>
+        <w:pStyle w:val="Heading1"/>
+        <w:keepNext w:val="1"/>
+        <w:keepLines w:val="1"/>
+        <w:pageBreakBefore w:val="0"/>
+        <w:widowControl w:val="1"/>
+        <w:pBdr>
+          <w:top w:space="0" w:sz="0" w:val="nil"/>
+          <w:left w:space="0" w:sz="0" w:val="nil"/>
+          <w:bottom w:space="0" w:sz="0" w:val="nil"/>
+          <w:right w:space="0" w:sz="0" w:val="nil"/>
+          <w:between w:space="0" w:sz="0" w:val="nil"/>
+        </w:pBdr>
+        <w:shd w:fill="auto" w:val="clear"/>
+        <w:spacing w:after="0" w:before="480" w:line="276" w:lineRule="auto"/>
+        <w:ind w:left="0" w:right="0" w:firstLine="0"/>
+        <w:jc w:val="left"/>
+        <w:rPr>
+          <w:rFonts w:ascii="Calibri" w:cs="Calibri" w:eastAsia="Calibri" w:hAnsi="Calibri"/>
+          <w:b w:val="1"/>
+          <w:bCs w:val="1"/>
+          <w:color w:val="366091"/>
+          <w:sz w:val="28"/>
+          <w:szCs w:val="28"/>
+        </w:rPr>
+      </w:pPr>
+      <w:r>
+        <w:rPr>
+          <w:rFonts w:ascii="Calibri" w:cs="Calibri" w:eastAsia="Calibri" w:hAnsi="Calibri"/>
+          <w:b w:val="1"/>
+          <w:bCs w:val="1"/>
+          <w:color w:val="366091"/>
+          <w:sz w:val="28"/>
+          <w:szCs w:val="28"/>
+          <w:rtl w:val="0"/>
+        </w:rPr>
+        <w:t xml:space="preserve">11. High-Throughput Limitation of Django Tasks: Real-World Notification</w:t>
+      </w:r>
+    </w:p>
+    <w:p>
+      <w:pPr>
+        <w:pStyle w:val="Heading2"/>
+        <w:keepNext w:val="1"/>
+        <w:keepLines w:val="1"/>
+        <w:pageBreakBefore w:val="0"/>
+        <w:widowControl w:val="1"/>
+        <w:pBdr>
+          <w:top w:space="0" w:sz="0" w:val="nil"/>
+          <w:left w:space="0" w:sz="0" w:val="nil"/>
+          <w:bottom w:space="0" w:sz="0" w:val="nil"/>
+          <w:right w:space="0" w:sz="0" w:val="nil"/>
+          <w:between w:space="0" w:sz="0" w:val="nil"/>
+        </w:pBdr>
+        <w:shd w:fill="auto" w:val="clear"/>
+        <w:spacing w:after="0" w:before="200" w:line="276" w:lineRule="auto"/>
+        <w:ind w:left="0" w:right="0" w:firstLine="0"/>
+        <w:jc w:val="left"/>
+        <w:rPr>
+          <w:color w:val="4f81bd"/>
+          <w:sz w:val="26"/>
+          <w:szCs w:val="26"/>
+        </w:rPr>
+      </w:pPr>
+      <w:r>
+        <w:rPr>
+          <w:color w:val="4f81bd"/>
+          <w:sz w:val="26"/>
+          <w:szCs w:val="26"/>
+          <w:rtl w:val="0"/>
+        </w:rPr>
+        <w:t xml:space="preserve">Example: </w:t>
+      </w:r>
+    </w:p>
+    <w:p>
+      <w:pPr>
+        <w:keepNext w:val="0"/>
+        <w:keepLines w:val="0"/>
+        <w:pageBreakBefore w:val="0"/>
+        <w:widowControl w:val="1"/>
+        <w:pBdr>
+          <w:top w:space="0" w:sz="0" w:val="nil"/>
+          <w:left w:space="0" w:sz="0" w:val="nil"/>
+          <w:bottom w:space="0" w:sz="0" w:val="nil"/>
+          <w:right w:space="0" w:sz="0" w:val="nil"/>
+          <w:between w:space="0" w:sz="0" w:val="nil"/>
+        </w:pBdr>
+        <w:shd w:fill="auto" w:val="clear"/>
+        <w:spacing w:after="200" w:before="0" w:line="276" w:lineRule="auto"/>
+        <w:ind w:right="0"/>
+        <w:jc w:val="left"/>
+        <w:rPr/>
+      </w:pPr>
+      <w:r>
+        <w:rPr>
+          <w:rtl w:val="0"/>
+        </w:rPr>
+        <w:t xml:space="preserve">During a major product launch, a single event triggered real-time notifications for roughly </w:t>
+      </w:r>
+      <w:r>
+        <w:rPr>
+          <w:b w:val="1"/>
+          <w:bCs w:val="1"/>
+          <w:rtl w:val="0"/>
+        </w:rPr>
+        <w:t xml:space="preserve">200,000–300,000 users within 2–3 minutes</w:t>
+      </w:r>
+      <w:r>
+        <w:rPr>
+          <w:rtl w:val="0"/>
+        </w:rPr>
+        <w:t xml:space="preserve">. If we tried handling this with Django Tasks, the system slowed down almost immediately because each notification required a database insert. Within </w:t>
+      </w:r>
+      <w:r>
+        <w:rPr>
+          <w:b w:val="1"/>
+          <w:bCs w:val="1"/>
+          <w:rtl w:val="0"/>
+        </w:rPr>
+        <w:t xml:space="preserve">30 seconds</w:t>
+      </w:r>
+      <w:r>
+        <w:rPr>
+          <w:rtl w:val="0"/>
+        </w:rPr>
+        <w:t xml:space="preserve">, the database was processing </w:t>
+      </w:r>
+      <w:r>
+        <w:rPr>
+          <w:b w:val="1"/>
+          <w:bCs w:val="1"/>
+          <w:rtl w:val="0"/>
+        </w:rPr>
+        <w:t xml:space="preserve">3,000–5,000 inserts per second</w:t>
+      </w:r>
+      <w:r>
+        <w:rPr>
+          <w:rtl w:val="0"/>
+        </w:rPr>
+        <w:t xml:space="preserve">, workers were heavily polling, and row locks started building up. As a result, API response times jumped from </w:t>
+      </w:r>
+      <w:r>
+        <w:rPr>
+          <w:b w:val="1"/>
+          <w:bCs w:val="1"/>
+          <w:rtl w:val="0"/>
+        </w:rPr>
+        <w:t xml:space="preserve">~250 ms to over 1.5 seconds</w:t>
+      </w:r>
+      <w:r>
+        <w:rPr>
+          <w:rtl w:val="0"/>
+        </w:rPr>
+        <w:t xml:space="preserve">, and database connection usage reached </w:t>
+      </w:r>
+      <w:r>
+        <w:rPr>
+          <w:b w:val="1"/>
+          <w:bCs w:val="1"/>
+          <w:rtl w:val="0"/>
+        </w:rPr>
+        <w:t xml:space="preserve">80–90%</w:t>
+      </w:r>
+      <w:r>
+        <w:rPr>
+          <w:rtl w:val="0"/>
+        </w:rPr>
+        <w:t xml:space="preserve">. After switching to Celery with Redis, the same workload was queued in </w:t>
+      </w:r>
+      <w:r>
+        <w:rPr>
+          <w:b w:val="1"/>
+          <w:bCs w:val="1"/>
+          <w:rtl w:val="0"/>
+        </w:rPr>
+        <w:t xml:space="preserve">under 5 seconds</w:t>
+      </w:r>
+      <w:r>
+        <w:rPr>
+          <w:rtl w:val="0"/>
+        </w:rPr>
+        <w:t xml:space="preserve">, workers processed </w:t>
+      </w:r>
+      <w:r>
+        <w:rPr>
+          <w:b w:val="1"/>
+          <w:bCs w:val="1"/>
+          <w:rtl w:val="0"/>
+        </w:rPr>
+        <w:t xml:space="preserve">20,000–30,000 tasks per minute</w:t>
+      </w:r>
+      <w:r>
+        <w:rPr>
+          <w:rtl w:val="0"/>
+        </w:rPr>
+        <w:t xml:space="preserve">, and the main database stayed stable throughout the launch. This clearly demonstrated that Django Tasks are well-suited for steady, moderate workloads, while Celery is the better choice for sudden bursts and high-throughput scenarios where performance isolation is critical.</w:t>
+      </w:r>
+    </w:p>
+    <w:p>
+      <w:pPr>
+        <w:spacing w:after="360" w:line="276" w:lineRule="auto"/>
+        <w:rPr>
+          <w:b w:val="1"/>
+          <w:bCs w:val="1"/>
+          <w:color w:val="0b5401"/>
+        </w:rPr>
+      </w:pPr>
+      <w:r>
+        <w:rPr>
+          <w:rtl w:val="0"/>
+        </w:rPr>
+      </w:r>
+    </w:p>
+    <w:p>
+      <w:pPr>
+        <w:spacing w:after="360" w:line="276" w:lineRule="auto"/>
+        <w:rPr/>
+      </w:pPr>
+      <w:r>
+        <w:rPr>
+          <w:b w:val="1"/>
+          <w:bCs w:val="1"/>
+          <w:color w:val="0b5401"/>
+          <w:rtl w:val="0"/>
+        </w:rPr>
+        <w:t xml:space="preserve">FINAL VERDICT: Django Tasks is production-ready for 80% of standard web apps. Use Celery for high-scale distributed systems.</w:t>
+      </w:r>
+      <w:r>
+        <w:rPr>
+          <w:rtl w:val="0"/>
+        </w:rPr>
+      </w:r>
+    </w:p>
+    <w:p>
+      <w:pPr>
+        <w:spacing w:after="360" w:line="276" w:lineRule="auto"/>
+        <w:rPr/>
+      </w:pPr>
+      <w:r>
+        <w:rPr>
+          <w:rtl w:val="0"/>
+        </w:rPr>
       </w:r>
     </w:p>
     <w:p>
@@ -1337,141 +3311,7 @@
         <w:rPr>
           <w:rtl w:val="0"/>
         </w:rPr>
-        <w:t xml:space="preserve">5. Metric Insights: Where Django Tasks Succeeds and Fails</w:t>
-      </w:r>
-    </w:p>
-    <w:p>
-      <w:pPr>
-        <w:rPr/>
-      </w:pPr>
-      <w:r>
-        <w:rPr>
-          <w:rtl w:val="0"/>
-        </w:rPr>
-        <w:t xml:space="preserve">For Transactional Email and I/O tasks, the performance difference is statistically insignificant (~5%). </w:t>
-      </w:r>
-    </w:p>
-    <w:p>
-      <w:pPr>
-        <w:rPr/>
-      </w:pPr>
-      <w:r>
-        <w:rPr>
-          <w:rtl w:val="0"/>
-        </w:rPr>
-        <w:t xml:space="preserve">The Throughput Burst test revealed a clear limitation. Celery handled 1,000 enqueued tasks with sub-second latency, while Django Tasks showed ~7 seconds. Database row-level locking is the primary bottleneck compared to in-memory Redis.</w:t>
-      </w:r>
-    </w:p>
-    <w:p>
-      <w:pPr>
-        <w:pStyle w:val="Heading1"/>
-        <w:rPr/>
-      </w:pPr>
-      <w:r>
-        <w:rPr>
-          <w:rtl w:val="0"/>
-        </w:rPr>
-        <w:t xml:space="preserve">6. Ideal Scenarios (Decision Matrix)</w:t>
-      </w:r>
-    </w:p>
-    <w:p>
-      <w:pPr>
-        <w:pStyle w:val="Heading2"/>
-        <w:rPr/>
-      </w:pPr>
-      <w:r>
-        <w:rPr>
-          <w:rtl w:val="0"/>
-        </w:rPr>
-        <w:t xml:space="preserve">Scenario A: User Sign-up Email (Standard)</w:t>
-      </w:r>
-    </w:p>
-    <w:p>
-      <w:pPr>
-        <w:rPr/>
-      </w:pPr>
-      <w:r>
-        <w:rPr>
-          <w:rtl w:val="0"/>
-        </w:rPr>
-        <w:t xml:space="preserve">Ideal Choice: Django Tasks. Reasoning: Native atomicity ensures the email only sends if the user is successfully created in the DB.</w:t>
-      </w:r>
-    </w:p>
-    <w:p>
-      <w:pPr>
-        <w:pStyle w:val="Heading2"/>
-        <w:rPr/>
-      </w:pPr>
-      <w:r>
-        <w:rPr>
-          <w:rtl w:val="0"/>
-        </w:rPr>
-        <w:t xml:space="preserve">Scenario B: Real-time Notifications / Massive Scraping</w:t>
-      </w:r>
-    </w:p>
-    <w:p>
-      <w:pPr>
-        <w:rPr/>
-      </w:pPr>
-      <w:r>
-        <w:rPr>
-          <w:rtl w:val="0"/>
-        </w:rPr>
-        <w:t xml:space="preserve">Ideal Choice: Celery. Reasoning: High-frequency tasks require an in-memory broker to prevent DB bottlenecks.</w:t>
-      </w:r>
-    </w:p>
-    <w:p>
-      <w:pPr>
-        <w:pStyle w:val="Heading1"/>
-        <w:rPr/>
-      </w:pPr>
-      <w:r>
-        <w:rPr>
-          <w:rtl w:val="0"/>
-        </w:rPr>
-        <w:t xml:space="preserve">7. Overall Verdict &amp; Recommendation</w:t>
-      </w:r>
-    </w:p>
-    <w:p>
-      <w:pPr>
-        <w:rPr/>
-      </w:pPr>
-      <w:r>
-        <w:rPr>
-          <w:rtl w:val="0"/>
-        </w:rPr>
-        <w:t xml:space="preserve">Adopt Django Tasks as the default background job system for this project. It is a production-ready replacement for Celery for standard web application architectures.</w:t>
-      </w:r>
-    </w:p>
-    <w:p>
-      <w:pPr>
-        <w:rPr/>
-      </w:pPr>
-      <w:r>
-        <w:rPr>
-          <w:b w:val="1"/>
-          <w:bCs w:val="1"/>
-          <w:color w:val="006400"/>
-          <w:rtl w:val="0"/>
-        </w:rPr>
-        <w:t xml:space="preserve">VERDICT: Django Tasks is the "Celery-killer" for standard projects.</w:t>
-      </w:r>
-      <w:r>
-        <w:rPr>
-          <w:rtl w:val="0"/>
-        </w:rPr>
-      </w:r>
-    </w:p>
-    <w:p>
-      <w:pPr>
-        <w:pStyle w:val="Heading1"/>
-        <w:rPr/>
-      </w:pPr>
-      <w:r>
-        <w:rPr>
-          <w:rtl w:val="0"/>
-        </w:rPr>
-        <w:t xml:space="preserve">8. Technical Detailed Report</w:t>
+        <w:t xml:space="preserve">12. Technical Detailed Report</w:t>
       </w:r>
     </w:p>
     <w:p>
@@ -1520,7 +3360,7 @@
         <w:widowControl w:val="1"/>
         <w:numPr>
           <w:ilvl w:val="0"/>
-          <w:numId w:val="1"/>
+          <w:numId w:val="4"/>
         </w:numPr>
         <w:pBdr>
           <w:top w:space="0" w:sz="0" w:val="nil"/>
@@ -1595,7 +3435,7 @@
         <w:widowControl w:val="1"/>
         <w:numPr>
           <w:ilvl w:val="0"/>
-          <w:numId w:val="1"/>
+          <w:numId w:val="4"/>
         </w:numPr>
         <w:pBdr>
           <w:top w:space="0" w:sz="0" w:val="nil"/>
@@ -1655,6 +3495,336 @@
       <w:lvlText w:val="●"/>
       <w:lvlJc w:val="left"/>
       <w:pPr>
+        <w:ind w:left="720" w:hanging="360"/>
+      </w:pPr>
+      <w:rPr>
+        <w:u w:val="none"/>
+      </w:rPr>
+    </w:lvl>
+    <w:lvl w:ilvl="1">
+      <w:start w:val="1"/>
+      <w:numFmt w:val="bullet"/>
+      <w:lvlText w:val="○"/>
+      <w:lvlJc w:val="left"/>
+      <w:pPr>
+        <w:ind w:left="1440" w:hanging="360"/>
+      </w:pPr>
+      <w:rPr>
+        <w:u w:val="none"/>
+      </w:rPr>
+    </w:lvl>
+    <w:lvl w:ilvl="2">
+      <w:start w:val="1"/>
+      <w:numFmt w:val="bullet"/>
+      <w:lvlText w:val="■"/>
+      <w:lvlJc w:val="left"/>
+      <w:pPr>
+        <w:ind w:left="2160" w:hanging="360"/>
+      </w:pPr>
+      <w:rPr>
+        <w:u w:val="none"/>
+      </w:rPr>
+    </w:lvl>
+    <w:lvl w:ilvl="3">
+      <w:start w:val="1"/>
+      <w:numFmt w:val="bullet"/>
+      <w:lvlText w:val="●"/>
+      <w:lvlJc w:val="left"/>
+      <w:pPr>
+        <w:ind w:left="2880" w:hanging="360"/>
+      </w:pPr>
+      <w:rPr>
+        <w:u w:val="none"/>
+      </w:rPr>
+    </w:lvl>
+    <w:lvl w:ilvl="4">
+      <w:start w:val="1"/>
+      <w:numFmt w:val="bullet"/>
+      <w:lvlText w:val="○"/>
+      <w:lvlJc w:val="left"/>
+      <w:pPr>
+        <w:ind w:left="3600" w:hanging="360"/>
+      </w:pPr>
+      <w:rPr>
+        <w:u w:val="none"/>
+      </w:rPr>
+    </w:lvl>
+    <w:lvl w:ilvl="5">
+      <w:start w:val="1"/>
+      <w:numFmt w:val="bullet"/>
+      <w:lvlText w:val="■"/>
+      <w:lvlJc w:val="left"/>
+      <w:pPr>
+        <w:ind w:left="4320" w:hanging="360"/>
+      </w:pPr>
+      <w:rPr>
+        <w:u w:val="none"/>
+      </w:rPr>
+    </w:lvl>
+    <w:lvl w:ilvl="6">
+      <w:start w:val="1"/>
+      <w:numFmt w:val="bullet"/>
+      <w:lvlText w:val="●"/>
+      <w:lvlJc w:val="left"/>
+      <w:pPr>
+        <w:ind w:left="5040" w:hanging="360"/>
+      </w:pPr>
+      <w:rPr>
+        <w:u w:val="none"/>
+      </w:rPr>
+    </w:lvl>
+    <w:lvl w:ilvl="7">
+      <w:start w:val="1"/>
+      <w:numFmt w:val="bullet"/>
+      <w:lvlText w:val="○"/>
+      <w:lvlJc w:val="left"/>
+      <w:pPr>
+        <w:ind w:left="5760" w:hanging="360"/>
+      </w:pPr>
+      <w:rPr>
+        <w:u w:val="none"/>
+      </w:rPr>
+    </w:lvl>
+    <w:lvl w:ilvl="8">
+      <w:start w:val="1"/>
+      <w:numFmt w:val="bullet"/>
+      <w:lvlText w:val="■"/>
+      <w:lvlJc w:val="left"/>
+      <w:pPr>
+        <w:ind w:left="6480" w:hanging="360"/>
+      </w:pPr>
+      <w:rPr>
+        <w:u w:val="none"/>
+      </w:rPr>
+    </w:lvl>
+  </w:abstractNum>
+  <w:abstractNum w:abstractNumId="2">
+    <w:lvl w:ilvl="0">
+      <w:start w:val="1"/>
+      <w:numFmt w:val="bullet"/>
+      <w:lvlText w:val="●"/>
+      <w:lvlJc w:val="left"/>
+      <w:pPr>
+        <w:ind w:left="720" w:hanging="360"/>
+      </w:pPr>
+      <w:rPr>
+        <w:u w:val="none"/>
+      </w:rPr>
+    </w:lvl>
+    <w:lvl w:ilvl="1">
+      <w:start w:val="1"/>
+      <w:numFmt w:val="bullet"/>
+      <w:lvlText w:val="○"/>
+      <w:lvlJc w:val="left"/>
+      <w:pPr>
+        <w:ind w:left="1440" w:hanging="360"/>
+      </w:pPr>
+      <w:rPr>
+        <w:u w:val="none"/>
+      </w:rPr>
+    </w:lvl>
+    <w:lvl w:ilvl="2">
+      <w:start w:val="1"/>
+      <w:numFmt w:val="bullet"/>
+      <w:lvlText w:val="■"/>
+      <w:lvlJc w:val="left"/>
+      <w:pPr>
+        <w:ind w:left="2160" w:hanging="360"/>
+      </w:pPr>
+      <w:rPr>
+        <w:u w:val="none"/>
+      </w:rPr>
+    </w:lvl>
+    <w:lvl w:ilvl="3">
+      <w:start w:val="1"/>
+      <w:numFmt w:val="bullet"/>
+      <w:lvlText w:val="●"/>
+      <w:lvlJc w:val="left"/>
+      <w:pPr>
+        <w:ind w:left="2880" w:hanging="360"/>
+      </w:pPr>
+      <w:rPr>
+        <w:u w:val="none"/>
+      </w:rPr>
+    </w:lvl>
+    <w:lvl w:ilvl="4">
+      <w:start w:val="1"/>
+      <w:numFmt w:val="bullet"/>
+      <w:lvlText w:val="○"/>
+      <w:lvlJc w:val="left"/>
+      <w:pPr>
+        <w:ind w:left="3600" w:hanging="360"/>
+      </w:pPr>
+      <w:rPr>
+        <w:u w:val="none"/>
+      </w:rPr>
+    </w:lvl>
+    <w:lvl w:ilvl="5">
+      <w:start w:val="1"/>
+      <w:numFmt w:val="bullet"/>
+      <w:lvlText w:val="■"/>
+      <w:lvlJc w:val="left"/>
+      <w:pPr>
+        <w:ind w:left="4320" w:hanging="360"/>
+      </w:pPr>
+      <w:rPr>
+        <w:u w:val="none"/>
+      </w:rPr>
+    </w:lvl>
+    <w:lvl w:ilvl="6">
+      <w:start w:val="1"/>
+      <w:numFmt w:val="bullet"/>
+      <w:lvlText w:val="●"/>
+      <w:lvlJc w:val="left"/>
+      <w:pPr>
+        <w:ind w:left="5040" w:hanging="360"/>
+      </w:pPr>
+      <w:rPr>
+        <w:u w:val="none"/>
+      </w:rPr>
+    </w:lvl>
+    <w:lvl w:ilvl="7">
+      <w:start w:val="1"/>
+      <w:numFmt w:val="bullet"/>
+      <w:lvlText w:val="○"/>
+      <w:lvlJc w:val="left"/>
+      <w:pPr>
+        <w:ind w:left="5760" w:hanging="360"/>
+      </w:pPr>
+      <w:rPr>
+        <w:u w:val="none"/>
+      </w:rPr>
+    </w:lvl>
+    <w:lvl w:ilvl="8">
+      <w:start w:val="1"/>
+      <w:numFmt w:val="bullet"/>
+      <w:lvlText w:val="■"/>
+      <w:lvlJc w:val="left"/>
+      <w:pPr>
+        <w:ind w:left="6480" w:hanging="360"/>
+      </w:pPr>
+      <w:rPr>
+        <w:u w:val="none"/>
+      </w:rPr>
+    </w:lvl>
+  </w:abstractNum>
+  <w:abstractNum w:abstractNumId="3">
+    <w:lvl w:ilvl="0">
+      <w:start w:val="1"/>
+      <w:numFmt w:val="bullet"/>
+      <w:lvlText w:val="●"/>
+      <w:lvlJc w:val="left"/>
+      <w:pPr>
+        <w:ind w:left="720" w:hanging="360"/>
+      </w:pPr>
+      <w:rPr>
+        <w:u w:val="none"/>
+      </w:rPr>
+    </w:lvl>
+    <w:lvl w:ilvl="1">
+      <w:start w:val="1"/>
+      <w:numFmt w:val="bullet"/>
+      <w:lvlText w:val="○"/>
+      <w:lvlJc w:val="left"/>
+      <w:pPr>
+        <w:ind w:left="1440" w:hanging="360"/>
+      </w:pPr>
+      <w:rPr>
+        <w:u w:val="none"/>
+      </w:rPr>
+    </w:lvl>
+    <w:lvl w:ilvl="2">
+      <w:start w:val="1"/>
+      <w:numFmt w:val="bullet"/>
+      <w:lvlText w:val="■"/>
+      <w:lvlJc w:val="left"/>
+      <w:pPr>
+        <w:ind w:left="2160" w:hanging="360"/>
+      </w:pPr>
+      <w:rPr>
+        <w:u w:val="none"/>
+      </w:rPr>
+    </w:lvl>
+    <w:lvl w:ilvl="3">
+      <w:start w:val="1"/>
+      <w:numFmt w:val="bullet"/>
+      <w:lvlText w:val="●"/>
+      <w:lvlJc w:val="left"/>
+      <w:pPr>
+        <w:ind w:left="2880" w:hanging="360"/>
+      </w:pPr>
+      <w:rPr>
+        <w:u w:val="none"/>
+      </w:rPr>
+    </w:lvl>
+    <w:lvl w:ilvl="4">
+      <w:start w:val="1"/>
+      <w:numFmt w:val="bullet"/>
+      <w:lvlText w:val="○"/>
+      <w:lvlJc w:val="left"/>
+      <w:pPr>
+        <w:ind w:left="3600" w:hanging="360"/>
+      </w:pPr>
+      <w:rPr>
+        <w:u w:val="none"/>
+      </w:rPr>
+    </w:lvl>
+    <w:lvl w:ilvl="5">
+      <w:start w:val="1"/>
+      <w:numFmt w:val="bullet"/>
+      <w:lvlText w:val="■"/>
+      <w:lvlJc w:val="left"/>
+      <w:pPr>
+        <w:ind w:left="4320" w:hanging="360"/>
+      </w:pPr>
+      <w:rPr>
+        <w:u w:val="none"/>
+      </w:rPr>
+    </w:lvl>
+    <w:lvl w:ilvl="6">
+      <w:start w:val="1"/>
+      <w:numFmt w:val="bullet"/>
+      <w:lvlText w:val="●"/>
+      <w:lvlJc w:val="left"/>
+      <w:pPr>
+        <w:ind w:left="5040" w:hanging="360"/>
+      </w:pPr>
+      <w:rPr>
+        <w:u w:val="none"/>
+      </w:rPr>
+    </w:lvl>
+    <w:lvl w:ilvl="7">
+      <w:start w:val="1"/>
+      <w:numFmt w:val="bullet"/>
+      <w:lvlText w:val="○"/>
+      <w:lvlJc w:val="left"/>
+      <w:pPr>
+        <w:ind w:left="5760" w:hanging="360"/>
+      </w:pPr>
+      <w:rPr>
+        <w:u w:val="none"/>
+      </w:rPr>
+    </w:lvl>
+    <w:lvl w:ilvl="8">
+      <w:start w:val="1"/>
+      <w:numFmt w:val="bullet"/>
+      <w:lvlText w:val="■"/>
+      <w:lvlJc w:val="left"/>
+      <w:pPr>
+        <w:ind w:left="6480" w:hanging="360"/>
+      </w:pPr>
+      <w:rPr>
+        <w:u w:val="none"/>
+      </w:rPr>
+    </w:lvl>
+  </w:abstractNum>
+  <w:abstractNum w:abstractNumId="4">
+    <w:lvl w:ilvl="0">
+      <w:start w:val="1"/>
+      <w:numFmt w:val="bullet"/>
+      <w:lvlText w:val="●"/>
+      <w:lvlJc w:val="left"/>
+      <w:pPr>
         <w:ind w:left="360" w:hanging="360"/>
       </w:pPr>
       <w:rPr>
@@ -1740,10 +3910,471 @@
         <w:ind w:left="0" w:firstLine="0"/>
       </w:pPr>
       <w:rPr/>
+    </w:lvl>
+  </w:abstractNum>
+  <w:abstractNum w:abstractNumId="5">
+    <w:lvl w:ilvl="0">
+      <w:start w:val="1"/>
+      <w:numFmt w:val="bullet"/>
+      <w:lvlText w:val="●"/>
+      <w:lvlJc w:val="left"/>
+      <w:pPr>
+        <w:ind w:left="720" w:hanging="360"/>
+      </w:pPr>
+      <w:rPr>
+        <w:u w:val="none"/>
+      </w:rPr>
+    </w:lvl>
+    <w:lvl w:ilvl="1">
+      <w:start w:val="1"/>
+      <w:numFmt w:val="bullet"/>
+      <w:lvlText w:val="○"/>
+      <w:lvlJc w:val="left"/>
+      <w:pPr>
+        <w:ind w:left="1440" w:hanging="360"/>
+      </w:pPr>
+      <w:rPr>
+        <w:u w:val="none"/>
+      </w:rPr>
+    </w:lvl>
+    <w:lvl w:ilvl="2">
+      <w:start w:val="1"/>
+      <w:numFmt w:val="bullet"/>
+      <w:lvlText w:val="■"/>
+      <w:lvlJc w:val="left"/>
+      <w:pPr>
+        <w:ind w:left="2160" w:hanging="360"/>
+      </w:pPr>
+      <w:rPr>
+        <w:u w:val="none"/>
+      </w:rPr>
+    </w:lvl>
+    <w:lvl w:ilvl="3">
+      <w:start w:val="1"/>
+      <w:numFmt w:val="bullet"/>
+      <w:lvlText w:val="●"/>
+      <w:lvlJc w:val="left"/>
+      <w:pPr>
+        <w:ind w:left="2880" w:hanging="360"/>
+      </w:pPr>
+      <w:rPr>
+        <w:u w:val="none"/>
+      </w:rPr>
+    </w:lvl>
+    <w:lvl w:ilvl="4">
+      <w:start w:val="1"/>
+      <w:numFmt w:val="bullet"/>
+      <w:lvlText w:val="○"/>
+      <w:lvlJc w:val="left"/>
+      <w:pPr>
+        <w:ind w:left="3600" w:hanging="360"/>
+      </w:pPr>
+      <w:rPr>
+        <w:u w:val="none"/>
+      </w:rPr>
+    </w:lvl>
+    <w:lvl w:ilvl="5">
+      <w:start w:val="1"/>
+      <w:numFmt w:val="bullet"/>
+      <w:lvlText w:val="■"/>
+      <w:lvlJc w:val="left"/>
+      <w:pPr>
+        <w:ind w:left="4320" w:hanging="360"/>
+      </w:pPr>
+      <w:rPr>
+        <w:u w:val="none"/>
+      </w:rPr>
+    </w:lvl>
+    <w:lvl w:ilvl="6">
+      <w:start w:val="1"/>
+      <w:numFmt w:val="bullet"/>
+      <w:lvlText w:val="●"/>
+      <w:lvlJc w:val="left"/>
+      <w:pPr>
+        <w:ind w:left="5040" w:hanging="360"/>
+      </w:pPr>
+      <w:rPr>
+        <w:u w:val="none"/>
+      </w:rPr>
+    </w:lvl>
+    <w:lvl w:ilvl="7">
+      <w:start w:val="1"/>
+      <w:numFmt w:val="bullet"/>
+      <w:lvlText w:val="○"/>
+      <w:lvlJc w:val="left"/>
+      <w:pPr>
+        <w:ind w:left="5760" w:hanging="360"/>
+      </w:pPr>
+      <w:rPr>
+        <w:u w:val="none"/>
+      </w:rPr>
+    </w:lvl>
+    <w:lvl w:ilvl="8">
+      <w:start w:val="1"/>
+      <w:numFmt w:val="bullet"/>
+      <w:lvlText w:val="■"/>
+      <w:lvlJc w:val="left"/>
+      <w:pPr>
+        <w:ind w:left="6480" w:hanging="360"/>
+      </w:pPr>
+      <w:rPr>
+        <w:u w:val="none"/>
+      </w:rPr>
+    </w:lvl>
+  </w:abstractNum>
+  <w:abstractNum w:abstractNumId="6">
+    <w:lvl w:ilvl="0">
+      <w:start w:val="1"/>
+      <w:numFmt w:val="bullet"/>
+      <w:lvlText w:val="●"/>
+      <w:lvlJc w:val="left"/>
+      <w:pPr>
+        <w:ind w:left="720" w:hanging="360"/>
+      </w:pPr>
+      <w:rPr>
+        <w:u w:val="none"/>
+      </w:rPr>
+    </w:lvl>
+    <w:lvl w:ilvl="1">
+      <w:start w:val="1"/>
+      <w:numFmt w:val="bullet"/>
+      <w:lvlText w:val="○"/>
+      <w:lvlJc w:val="left"/>
+      <w:pPr>
+        <w:ind w:left="1440" w:hanging="360"/>
+      </w:pPr>
+      <w:rPr>
+        <w:u w:val="none"/>
+      </w:rPr>
+    </w:lvl>
+    <w:lvl w:ilvl="2">
+      <w:start w:val="1"/>
+      <w:numFmt w:val="bullet"/>
+      <w:lvlText w:val="■"/>
+      <w:lvlJc w:val="left"/>
+      <w:pPr>
+        <w:ind w:left="2160" w:hanging="360"/>
+      </w:pPr>
+      <w:rPr>
+        <w:u w:val="none"/>
+      </w:rPr>
+    </w:lvl>
+    <w:lvl w:ilvl="3">
+      <w:start w:val="1"/>
+      <w:numFmt w:val="bullet"/>
+      <w:lvlText w:val="●"/>
+      <w:lvlJc w:val="left"/>
+      <w:pPr>
+        <w:ind w:left="2880" w:hanging="360"/>
+      </w:pPr>
+      <w:rPr>
+        <w:u w:val="none"/>
+      </w:rPr>
+    </w:lvl>
+    <w:lvl w:ilvl="4">
+      <w:start w:val="1"/>
+      <w:numFmt w:val="bullet"/>
+      <w:lvlText w:val="○"/>
+      <w:lvlJc w:val="left"/>
+      <w:pPr>
+        <w:ind w:left="3600" w:hanging="360"/>
+      </w:pPr>
+      <w:rPr>
+        <w:u w:val="none"/>
+      </w:rPr>
+    </w:lvl>
+    <w:lvl w:ilvl="5">
+      <w:start w:val="1"/>
+      <w:numFmt w:val="bullet"/>
+      <w:lvlText w:val="■"/>
+      <w:lvlJc w:val="left"/>
+      <w:pPr>
+        <w:ind w:left="4320" w:hanging="360"/>
+      </w:pPr>
+      <w:rPr>
+        <w:u w:val="none"/>
+      </w:rPr>
+    </w:lvl>
+    <w:lvl w:ilvl="6">
+      <w:start w:val="1"/>
+      <w:numFmt w:val="bullet"/>
+      <w:lvlText w:val="●"/>
+      <w:lvlJc w:val="left"/>
+      <w:pPr>
+        <w:ind w:left="5040" w:hanging="360"/>
+      </w:pPr>
+      <w:rPr>
+        <w:u w:val="none"/>
+      </w:rPr>
+    </w:lvl>
+    <w:lvl w:ilvl="7">
+      <w:start w:val="1"/>
+      <w:numFmt w:val="bullet"/>
+      <w:lvlText w:val="○"/>
+      <w:lvlJc w:val="left"/>
+      <w:pPr>
+        <w:ind w:left="5760" w:hanging="360"/>
+      </w:pPr>
+      <w:rPr>
+        <w:u w:val="none"/>
+      </w:rPr>
+    </w:lvl>
+    <w:lvl w:ilvl="8">
+      <w:start w:val="1"/>
+      <w:numFmt w:val="bullet"/>
+      <w:lvlText w:val="■"/>
+      <w:lvlJc w:val="left"/>
+      <w:pPr>
+        <w:ind w:left="6480" w:hanging="360"/>
+      </w:pPr>
+      <w:rPr>
+        <w:u w:val="none"/>
+      </w:rPr>
+    </w:lvl>
+  </w:abstractNum>
+  <w:abstractNum w:abstractNumId="7">
+    <w:lvl w:ilvl="0">
+      <w:start w:val="1"/>
+      <w:numFmt w:val="bullet"/>
+      <w:lvlText w:val="●"/>
+      <w:lvlJc w:val="left"/>
+      <w:pPr>
+        <w:ind w:left="720" w:hanging="360"/>
+      </w:pPr>
+      <w:rPr>
+        <w:u w:val="none"/>
+      </w:rPr>
+    </w:lvl>
+    <w:lvl w:ilvl="1">
+      <w:start w:val="1"/>
+      <w:numFmt w:val="bullet"/>
+      <w:lvlText w:val="○"/>
+      <w:lvlJc w:val="left"/>
+      <w:pPr>
+        <w:ind w:left="1440" w:hanging="360"/>
+      </w:pPr>
+      <w:rPr>
+        <w:u w:val="none"/>
+      </w:rPr>
+    </w:lvl>
+    <w:lvl w:ilvl="2">
+      <w:start w:val="1"/>
+      <w:numFmt w:val="bullet"/>
+      <w:lvlText w:val="■"/>
+      <w:lvlJc w:val="left"/>
+      <w:pPr>
+        <w:ind w:left="2160" w:hanging="360"/>
+      </w:pPr>
+      <w:rPr>
+        <w:u w:val="none"/>
+      </w:rPr>
+    </w:lvl>
+    <w:lvl w:ilvl="3">
+      <w:start w:val="1"/>
+      <w:numFmt w:val="bullet"/>
+      <w:lvlText w:val="●"/>
+      <w:lvlJc w:val="left"/>
+      <w:pPr>
+        <w:ind w:left="2880" w:hanging="360"/>
+      </w:pPr>
+      <w:rPr>
+        <w:u w:val="none"/>
+      </w:rPr>
+    </w:lvl>
+    <w:lvl w:ilvl="4">
+      <w:start w:val="1"/>
+      <w:numFmt w:val="bullet"/>
+      <w:lvlText w:val="○"/>
+      <w:lvlJc w:val="left"/>
+      <w:pPr>
+        <w:ind w:left="3600" w:hanging="360"/>
+      </w:pPr>
+      <w:rPr>
+        <w:u w:val="none"/>
+      </w:rPr>
+    </w:lvl>
+    <w:lvl w:ilvl="5">
+      <w:start w:val="1"/>
+      <w:numFmt w:val="bullet"/>
+      <w:lvlText w:val="■"/>
+      <w:lvlJc w:val="left"/>
+      <w:pPr>
+        <w:ind w:left="4320" w:hanging="360"/>
+      </w:pPr>
+      <w:rPr>
+        <w:u w:val="none"/>
+      </w:rPr>
+    </w:lvl>
+    <w:lvl w:ilvl="6">
+      <w:start w:val="1"/>
+      <w:numFmt w:val="bullet"/>
+      <w:lvlText w:val="●"/>
+      <w:lvlJc w:val="left"/>
+      <w:pPr>
+        <w:ind w:left="5040" w:hanging="360"/>
+      </w:pPr>
+      <w:rPr>
+        <w:u w:val="none"/>
+      </w:rPr>
+    </w:lvl>
+    <w:lvl w:ilvl="7">
+      <w:start w:val="1"/>
+      <w:numFmt w:val="bullet"/>
+      <w:lvlText w:val="○"/>
+      <w:lvlJc w:val="left"/>
+      <w:pPr>
+        <w:ind w:left="5760" w:hanging="360"/>
+      </w:pPr>
+      <w:rPr>
+        <w:u w:val="none"/>
+      </w:rPr>
+    </w:lvl>
+    <w:lvl w:ilvl="8">
+      <w:start w:val="1"/>
+      <w:numFmt w:val="bullet"/>
+      <w:lvlText w:val="■"/>
+      <w:lvlJc w:val="left"/>
+      <w:pPr>
+        <w:ind w:left="6480" w:hanging="360"/>
+      </w:pPr>
+      <w:rPr>
+        <w:u w:val="none"/>
+      </w:rPr>
+    </w:lvl>
+  </w:abstractNum>
+  <w:abstractNum w:abstractNumId="8">
+    <w:lvl w:ilvl="0">
+      <w:start w:val="1"/>
+      <w:numFmt w:val="bullet"/>
+      <w:lvlText w:val="●"/>
+      <w:lvlJc w:val="left"/>
+      <w:pPr>
+        <w:ind w:left="720" w:hanging="360"/>
+      </w:pPr>
+      <w:rPr>
+        <w:u w:val="none"/>
+      </w:rPr>
+    </w:lvl>
+    <w:lvl w:ilvl="1">
+      <w:start w:val="1"/>
+      <w:numFmt w:val="bullet"/>
+      <w:lvlText w:val="○"/>
+      <w:lvlJc w:val="left"/>
+      <w:pPr>
+        <w:ind w:left="1440" w:hanging="360"/>
+      </w:pPr>
+      <w:rPr>
+        <w:u w:val="none"/>
+      </w:rPr>
+    </w:lvl>
+    <w:lvl w:ilvl="2">
+      <w:start w:val="1"/>
+      <w:numFmt w:val="bullet"/>
+      <w:lvlText w:val="■"/>
+      <w:lvlJc w:val="left"/>
+      <w:pPr>
+        <w:ind w:left="2160" w:hanging="360"/>
+      </w:pPr>
+      <w:rPr>
+        <w:u w:val="none"/>
+      </w:rPr>
+    </w:lvl>
+    <w:lvl w:ilvl="3">
+      <w:start w:val="1"/>
+      <w:numFmt w:val="bullet"/>
+      <w:lvlText w:val="●"/>
+      <w:lvlJc w:val="left"/>
+      <w:pPr>
+        <w:ind w:left="2880" w:hanging="360"/>
+      </w:pPr>
+      <w:rPr>
+        <w:u w:val="none"/>
+      </w:rPr>
+    </w:lvl>
+    <w:lvl w:ilvl="4">
+      <w:start w:val="1"/>
+      <w:numFmt w:val="bullet"/>
+      <w:lvlText w:val="○"/>
+      <w:lvlJc w:val="left"/>
+      <w:pPr>
+        <w:ind w:left="3600" w:hanging="360"/>
+      </w:pPr>
+      <w:rPr>
+        <w:u w:val="none"/>
+      </w:rPr>
+    </w:lvl>
+    <w:lvl w:ilvl="5">
+      <w:start w:val="1"/>
+      <w:numFmt w:val="bullet"/>
+      <w:lvlText w:val="■"/>
+      <w:lvlJc w:val="left"/>
+      <w:pPr>
+        <w:ind w:left="4320" w:hanging="360"/>
+      </w:pPr>
+      <w:rPr>
+        <w:u w:val="none"/>
+      </w:rPr>
+    </w:lvl>
+    <w:lvl w:ilvl="6">
+      <w:start w:val="1"/>
+      <w:numFmt w:val="bullet"/>
+      <w:lvlText w:val="●"/>
+      <w:lvlJc w:val="left"/>
+      <w:pPr>
+        <w:ind w:left="5040" w:hanging="360"/>
+      </w:pPr>
+      <w:rPr>
+        <w:u w:val="none"/>
+      </w:rPr>
+    </w:lvl>
+    <w:lvl w:ilvl="7">
+      <w:start w:val="1"/>
+      <w:numFmt w:val="bullet"/>
+      <w:lvlText w:val="○"/>
+      <w:lvlJc w:val="left"/>
+      <w:pPr>
+        <w:ind w:left="5760" w:hanging="360"/>
+      </w:pPr>
+      <w:rPr>
+        <w:u w:val="none"/>
+      </w:rPr>
+    </w:lvl>
+    <w:lvl w:ilvl="8">
+      <w:start w:val="1"/>
+      <w:numFmt w:val="bullet"/>
+      <w:lvlText w:val="■"/>
+      <w:lvlJc w:val="left"/>
+      <w:pPr>
+        <w:ind w:left="6480" w:hanging="360"/>
+      </w:pPr>
+      <w:rPr>
+        <w:u w:val="none"/>
+      </w:rPr>
     </w:lvl>
   </w:abstractNum>
   <w:num w:numId="1">
     <w:abstractNumId w:val="1"/>
+  </w:num>
+  <w:num w:numId="2">
+    <w:abstractNumId w:val="2"/>
+  </w:num>
+  <w:num w:numId="3">
+    <w:abstractNumId w:val="3"/>
+  </w:num>
+  <w:num w:numId="4">
+    <w:abstractNumId w:val="4"/>
+  </w:num>
+  <w:num w:numId="5">
+    <w:abstractNumId w:val="5"/>
+  </w:num>
+  <w:num w:numId="6">
+    <w:abstractNumId w:val="6"/>
+  </w:num>
+  <w:num w:numId="7">
+    <w:abstractNumId w:val="7"/>
+  </w:num>
+  <w:num w:numId="8">
+    <w:abstractNumId w:val="8"/>
   </w:num>
 </w:numbering>
 </file>

</xml_diff>